<commit_message>
fix(bmAgmMinutes): chairman unnumbered, shareholders restart numbering at 1
The attendee list previously numbered chairman and shareholders as
one continuous sequence (1. chairman, 2. shareholder, 3. shareholder
...). Per correction: chairman is listed on its own with no number,
and shareholders get their own independent numbering starting at 1
(1. shareholder, 2. shareholder, 3. shareholder...).

Removes the hardcoded "१." prefix from both उपस्थिति occurrences in
the template (Board Meeting and AGM sections) - the "श्री" honorific
in the AGM section is preserved. bmBuildShareholderList() now starts
numbering at 1 instead of 2.

Verified against the real committed template: chairman renders with
no leading numeral, first shareholder is numbered १ (not २), second
is २ (not ३), 0 unresolved tokens, full real end-to-end generation
through the actual UI. No regressions to Report Generator, Send
Document, or Clients tab.
</commit_message>
<xml_diff>
--- a/assets/templates/bm-agm-minutes.docx
+++ b/assets/templates/bm-agm-minutes.docx
@@ -134,7 +134,7 @@
           <w:szCs w:val="32"/>
           <w:lang w:eastAsia="zh-HK"/>
         </w:rPr>
-        <w:t xml:space="preserve">उपस्थिति ः१. {{chairmanName}}</w:t>
+        <w:t xml:space="preserve">उपस्थिति ः {{chairmanName}}</w:t>
       </w:r>
     </w:p>
     <w:p>
@@ -679,7 +679,7 @@
           <w:szCs w:val="32"/>
           <w:lang w:eastAsia="zh-HK"/>
         </w:rPr>
-        <w:t xml:space="preserve">उपस्थितिःः१.श्री{{chairmanName}}</w:t>
+        <w:t xml:space="preserve">उपस्थितिःः श्री{{chairmanName}}</w:t>
       </w:r>
     </w:p>
     <w:p>

</xml_diff>

<commit_message>
fix(bmAgmMinutes): correct remaining three words affected by unmapped 'A'
Capital 'A' in the source Preeti has no consistent single-character
mapping I could confidently derive (two of three occurrences implied
one glyph, the third didn't fit), so rather than guess a general rule
that risks new errors elsewhere, applied targeted corrections for the
three specific words affected, confirmed correct by the user:
Aयक्ति -> व्यक्ति, Aयय -> व्यय, Aाोधार्थ -> बोधार्थ.

Rebuilt the whole template from the reconfirmed reference file with
this fix added; verified end to end through the real app - 0
unresolved tokens, all three words now correct, no literal 'A'
remaining anywhere in the output, and every prior fix (रजिष्ट्रार,
डिवेञ्चर, shareholder separation, chairman numbering, tokenization
gaps) still intact. No regressions.

This closes out Problem 1 (formatting/Nepali text fidelity) from the
current phase.
</commit_message>
<xml_diff>
--- a/assets/templates/bm-agm-minutes.docx
+++ b/assets/templates/bm-agm-minutes.docx
@@ -2430,7 +2430,7 @@
                 <w:szCs w:val="32"/>
                 <w:lang w:eastAsia="zh-HK"/>
               </w:rPr>
-              <w:t xml:space="preserve">बैक,वित्तिय संस्था वा अन्य कुनै Aयक्तिबाट लिएको ऋणा वा कम्पनीले दिएको जमानत</w:t>
+              <w:t xml:space="preserve">बैक,वित्तिय संस्था वा अन्य कुनै व्यक्तिबाट लिएको ऋणा वा कम्पनीले दिएको जमानत</w:t>
             </w:r>
           </w:p>
         </w:tc>
@@ -2478,7 +2478,7 @@
                 <w:szCs w:val="32"/>
                 <w:lang w:eastAsia="zh-HK"/>
               </w:rPr>
-              <w:t xml:space="preserve">आय Aयय विवरणमा उल्लेख भए बमोजिम</w:t>
+              <w:t xml:space="preserve">आय व्यय विवरणमा उल्लेख भए बमोजिम</w:t>
             </w:r>
           </w:p>
         </w:tc>
@@ -3711,7 +3711,7 @@
           <w:sz w:val="32"/>
           <w:szCs w:val="32"/>
         </w:rPr>
-        <w:t xml:space="preserve">Aाोधार्थ ः श्री ए. एल. एसोसिएट्स</w:t>
+        <w:t xml:space="preserve">बोधार्थ ः श्री ए. एल. एसोसिएट्स</w:t>
       </w:r>
     </w:p>
     <w:p>

</xml_diff>

<commit_message>
fix(bmAgmMinutes): manual formatting/spacing correction to BM/AGM Word template
Template edited directly in Word by the user to fix layout/spacing issues.
Verified after editing: every {{tag}} still present and resolves correctly
through docxtemplater (Word's spellcheck had split several tags — companyName,
chairmanName, auditFirmName, fiscalYear, letterDate, registrationNumber —
across separate XML runs while editing nearby text, but docxtemplater's
paragraph-level text concatenation handled it without issue). Rendered with
test data end-to-end: all fields substitute correctly, no leftover {{tags}},
shareholders repeat block works, no code changes required.

Co-Authored-By: Claude Sonnet 5 <noreply@anthropic.com>
</commit_message>
<xml_diff>
--- a/assets/templates/bm-agm-minutes.docx
+++ b/assets/templates/bm-agm-minutes.docx
@@ -20,7 +20,7 @@
           <w:sz w:val="74"/>
           <w:szCs w:val="8"/>
         </w:rPr>
-        <w:t xml:space="preserve">{{companyName}} प्रा.लि.</w:t>
+        <w:t>{{companyName}} प्रा.लि.</w:t>
       </w:r>
     </w:p>
     <w:p>
@@ -73,7 +73,7 @@
           <w:sz w:val="36"/>
           <w:szCs w:val="36"/>
         </w:rPr>
-        <w:t xml:space="preserve">संचालक समितिको बैठक</w:t>
+        <w:t>संचालक समितिको बैठक</w:t>
       </w:r>
     </w:p>
     <w:p>
@@ -158,7 +158,7 @@
           <w:szCs w:val="32"/>
           <w:lang w:eastAsia="zh-HK"/>
         </w:rPr>
-        <w:t xml:space="preserve">को अध्यक्षतामा कम्पनीको संचालक समितिको बैठक बसी निम्नानुसारको प्रस्ताव उपर छलफल गरि निम्नानुसारको निर्णय गरियो .</w:t>
+        <w:t>को अध्यक्षतामा कम्पनीको संचालक समितिको बैठक बसी निम्नानुसारको प्रस्ताव उपर छलफल गरि निम्नानुसारको निर्णय गरियो .</w:t>
       </w:r>
     </w:p>
     <w:p>
@@ -192,7 +192,7 @@
           <w:sz w:val="36"/>
           <w:szCs w:val="36"/>
         </w:rPr>
-        <w:t xml:space="preserve">{{chairmanName}}</w:t>
+        <w:t>{{chairmanName}}</w:t>
       </w:r>
     </w:p>
     <w:p>
@@ -286,7 +286,7 @@
           <w:u w:val="single"/>
           <w:lang w:val="pt-BR"/>
         </w:rPr>
-        <w:t xml:space="preserve">छलफलका विषयहरू</w:t>
+        <w:t>छलफलका विषयहरू</w:t>
       </w:r>
       <w:r>
         <w:rPr>
@@ -319,7 +319,7 @@
           <w:szCs w:val="32"/>
           <w:lang w:val="pl-PL"/>
         </w:rPr>
-        <w:t xml:space="preserve">१.कम्पनीको वार्षिक साधारण सभाको मिति, स्थान र छलफलका विषय निश्चित गर्ने सम्बन्धमा,</w:t>
+        <w:t>१.कम्पनीको वार्षिक साधारण सभाको मिति, स्थान र छलफलका विषय निश्चित गर्ने सम्बन्धमा,</w:t>
       </w:r>
     </w:p>
     <w:p>
@@ -343,7 +343,8 @@
           <w:szCs w:val="32"/>
           <w:lang w:val="pl-PL"/>
         </w:rPr>
-        <w:t xml:space="preserve">२.विविध .</w:t>
+        <w:lastRenderedPageBreak/>
+        <w:t>२.विविध .</w:t>
       </w:r>
     </w:p>
     <w:p>
@@ -369,7 +370,7 @@
           <w:u w:val="single"/>
           <w:lang w:val="pl-PL"/>
         </w:rPr>
-        <w:t xml:space="preserve">छलफल तथा निर्णयहरू</w:t>
+        <w:t>छलफल तथा निर्णयहरू</w:t>
       </w:r>
       <w:r>
         <w:rPr>
@@ -378,7 +379,7 @@
           <w:szCs w:val="32"/>
           <w:lang w:val="da-DK"/>
         </w:rPr>
-        <w:t xml:space="preserve">ः–</w:t>
+        <w:t>ः–</w:t>
       </w:r>
     </w:p>
     <w:p>
@@ -403,7 +404,7 @@
           <w:szCs w:val="32"/>
           <w:lang w:val="pl-PL"/>
         </w:rPr>
-        <w:t xml:space="preserve">१.कम्पनीको वार्षिक साधारण सभा बस्ने सम्बन्धमा ः–</w:t>
+        <w:t>१.कम्पनीको वार्षिक साधारण सभा बस्ने सम्बन्धमा ः–</w:t>
       </w:r>
     </w:p>
     <w:p>
@@ -429,7 +430,7 @@
           <w:szCs w:val="32"/>
           <w:lang w:val="pl-PL"/>
         </w:rPr>
-        <w:t xml:space="preserve">क_यस कम्पनीको प्रबन्ध पत्र, तथा नियमावली बमोजिम बोलाउनु पर्ने कम्पनीको वार्षिक साधारण सभा बोलाउन आवश्यक भएकोले आगामी {{agmDateFull}} गते दिनको {{agmTime}} बजे कम्पनीको कार्यालयमा कम्पनीको वार्षिक साधारण सभा बोलाउने निर्णय गरिएको छ .</w:t>
+        <w:t>क_यस कम्पनीको प्रबन्ध पत्र, तथा नियमावली बमोजिम बोलाउनु पर्ने कम्पनीको वार्षिक साधारण सभा बोलाउन आवश्यक भएकोले आगामी {{agmDateFull}} गते दिनको {{agmTime}} बजे कम्पनीको कार्यालयमा कम्पनीको वार्षिक साधारण सभा बोलाउने निर्णय गरिएको छ .</w:t>
       </w:r>
     </w:p>
     <w:p>
@@ -455,7 +456,7 @@
           <w:szCs w:val="32"/>
           <w:lang w:val="pl-PL"/>
         </w:rPr>
-        <w:t xml:space="preserve">ख_माथि खणड -क_ बमोजिम बस्ने वार्षिक साधारण सभामा छलफलको निमित्त देहायका विषयहरू समावेश गर्ने निर्णय गरिएको छ ः–</w:t>
+        <w:t>ख_माथि खणड -क_ बमोजिम बस्ने वार्षिक साधारण सभामा छलफलको निमित्त देहायका विषयहरू समावेश गर्ने निर्णय गरिएको छ ः–</w:t>
       </w:r>
     </w:p>
     <w:p>
@@ -480,7 +481,7 @@
           <w:szCs w:val="32"/>
           <w:lang w:val="pl-PL"/>
         </w:rPr>
-        <w:t xml:space="preserve">१_अध्यक्षज्यूको प्रतिवेदन सम्बन्धमा .</w:t>
+        <w:t>१_अध्यक्षज्यूको प्रतिवेदन सम्बन्धमा .</w:t>
       </w:r>
     </w:p>
     <w:p>
@@ -505,7 +506,7 @@
           <w:szCs w:val="32"/>
           <w:lang w:val="pl-PL"/>
         </w:rPr>
-        <w:t xml:space="preserve">२_आ.व.{{fiscalYear}} को लेखापरीक्षण प्रतिवेदन सम्बन्धमा .</w:t>
+        <w:t>२_आ.व.{{fiscalYear}} को लेखापरीक्षण प्रतिवेदन सम्बन्धमा .</w:t>
       </w:r>
     </w:p>
     <w:p>
@@ -530,7 +531,7 @@
           <w:szCs w:val="32"/>
           <w:lang w:val="pl-PL"/>
         </w:rPr>
-        <w:t xml:space="preserve">३_आ.व. {{nextFiscalYear}} को निमित्त लेखापरीक्षक नियुक्ति र पारिश्रमिक तय गर्ने सम्बन्धमा .</w:t>
+        <w:t>३_आ.व. {{nextFiscalYear}} को निमित्त लेखापरीक्षक नियुक्ति र पारिश्रमिक तय गर्ने सम्बन्धमा .</w:t>
       </w:r>
     </w:p>
     <w:p>
@@ -555,7 +556,7 @@
           <w:szCs w:val="32"/>
           <w:lang w:val="pl-PL"/>
         </w:rPr>
-        <w:t xml:space="preserve">४_विविध .</w:t>
+        <w:t>४_विविध .</w:t>
       </w:r>
     </w:p>
     <w:p>
@@ -697,7 +698,8 @@
           <w:sz w:val="74"/>
           <w:szCs w:val="8"/>
         </w:rPr>
-        <w:t xml:space="preserve">{{companyName}}प्रा.लि.</w:t>
+        <w:lastRenderedPageBreak/>
+        <w:t>{{companyName}}प्रा.लि.</w:t>
       </w:r>
     </w:p>
     <w:p>
@@ -738,7 +740,7 @@
           <w:sz w:val="44"/>
           <w:szCs w:val="44"/>
         </w:rPr>
-        <w:t xml:space="preserve">वार्षिक साधारण सभा</w:t>
+        <w:t>वार्षिक साधारण सभा</w:t>
       </w:r>
     </w:p>
     <w:p>
@@ -784,7 +786,7 @@
           <w:sz w:val="48"/>
           <w:szCs w:val="8"/>
         </w:rPr>
-        <w:t xml:space="preserve">{{companyName}} प्रा.लि.</w:t>
+        <w:t>{{companyName}} प्रा.लि.</w:t>
       </w:r>
       <w:r>
         <w:rPr>
@@ -813,7 +815,7 @@
           <w:sz w:val="36"/>
           <w:szCs w:val="36"/>
         </w:rPr>
-        <w:t xml:space="preserve">{{chairmanName}}</w:t>
+        <w:t>{{chairmanName}}</w:t>
       </w:r>
       <w:r>
         <w:rPr>
@@ -848,7 +850,7 @@
           <w:szCs w:val="32"/>
           <w:lang w:eastAsia="zh-HK"/>
         </w:rPr>
-        <w:t xml:space="preserve">उपस्थितिःः श्री</w:t>
+        <w:t>उपस्थितिःः श्री</w:t>
       </w:r>
       <w:r>
         <w:rPr>
@@ -857,7 +859,7 @@
           <w:sz w:val="36"/>
           <w:szCs w:val="36"/>
         </w:rPr>
-        <w:t xml:space="preserve">{{chairmanName}}</w:t>
+        <w:t>{{chairmanName}}</w:t>
       </w:r>
     </w:p>
     <w:p>
@@ -975,7 +977,7 @@
           <w:szCs w:val="32"/>
           <w:lang w:eastAsia="zh-HK"/>
         </w:rPr>
-        <w:t xml:space="preserve">सभाको व</w:t>
+        <w:t>सभाको व</w:t>
       </w:r>
       <w:r>
         <w:rPr>
@@ -986,7 +988,7 @@
           <w:szCs w:val="32"/>
           <w:lang w:eastAsia="zh-HK"/>
         </w:rPr>
-        <w:t xml:space="preserve">ै</w:t>
+        <w:t>ै</w:t>
       </w:r>
       <w:r>
         <w:rPr>
@@ -995,7 +997,7 @@
           <w:szCs w:val="32"/>
           <w:lang w:eastAsia="zh-HK"/>
         </w:rPr>
-        <w:t xml:space="preserve">धानिकता</w:t>
+        <w:t>धानिकता</w:t>
       </w:r>
     </w:p>
     <w:p>
@@ -1017,7 +1019,7 @@
           <w:szCs w:val="32"/>
           <w:lang w:eastAsia="zh-HK"/>
         </w:rPr>
-        <w:t xml:space="preserve">सभाको व</w:t>
+        <w:t>सभाको व</w:t>
       </w:r>
       <w:r>
         <w:rPr>
@@ -1028,7 +1030,7 @@
           <w:szCs w:val="32"/>
           <w:lang w:eastAsia="zh-HK"/>
         </w:rPr>
-        <w:t xml:space="preserve">ै</w:t>
+        <w:t>ै</w:t>
       </w:r>
       <w:r>
         <w:rPr>
@@ -1037,7 +1039,17 @@
           <w:szCs w:val="32"/>
           <w:lang w:eastAsia="zh-HK"/>
         </w:rPr>
-        <w:t xml:space="preserve">धानिकता माथि छलफछ गर्दा कम्पनी ऐन २०६३ र अन्य नियममा भएका व्यवस्था अनुसार नै साधारण सभा वोलाइएवाट र  गणापुरक संख्या पनि भएवाट सभा संचालन गर्न वैधानिक हुने ठहर गरियो . </w:t>
+        <w:t xml:space="preserve">धानिकता माथि छलफछ गर्दा कम्पनी ऐन २०६३ र अन्य नियममा भएका व्यवस्था अनुसार नै साधारण सभा वोलाइएवाट र  </w:t>
+      </w:r>
+      <w:r>
+        <w:rPr>
+          <w:rFonts w:ascii="Mangal" w:eastAsia="PMingLiU" w:hAnsi="Mangal"/>
+          <w:sz w:val="32"/>
+          <w:szCs w:val="32"/>
+          <w:lang w:eastAsia="zh-HK"/>
+        </w:rPr>
+        <w:lastRenderedPageBreak/>
+        <w:t xml:space="preserve">गणापुरक संख्या पनि भएवाट सभा संचालन गर्न वैधानिक हुने ठहर गरियो . </w:t>
       </w:r>
     </w:p>
     <w:p>
@@ -1079,7 +1091,7 @@
           <w:szCs w:val="32"/>
           <w:lang w:eastAsia="zh-HK"/>
         </w:rPr>
-        <w:t xml:space="preserve">प्रस्तावहरू ः</w:t>
+        <w:t>प्रस्तावहरू ः</w:t>
       </w:r>
     </w:p>
     <w:p>
@@ -1104,7 +1116,7 @@
           <w:szCs w:val="32"/>
           <w:lang w:eastAsia="zh-HK"/>
         </w:rPr>
-        <w:t xml:space="preserve">प्रस्ताव नं. १ः अध्यक्षज्यूको प्रतिवेदन सम्बन्धमा .</w:t>
+        <w:t>प्रस्ताव नं. १ः अध्यक्षज्यूको प्रतिवेदन सम्बन्धमा .</w:t>
       </w:r>
     </w:p>
     <w:p>
@@ -1129,7 +1141,7 @@
           <w:szCs w:val="32"/>
           <w:lang w:eastAsia="zh-HK"/>
         </w:rPr>
-        <w:t xml:space="preserve">प्रस्ताव नं. २ ः आर्थिक वर्ष {{fiscalYear}} को लेखा परीक्षक प्रतिवेदन अनुमोदन सम्बन्धमा.</w:t>
+        <w:t>प्रस्ताव नं. २ ः आर्थिक वर्ष {{fiscalYear}} को लेखा परीक्षक प्रतिवेदन अनुमोदन सम्बन्धमा.</w:t>
       </w:r>
     </w:p>
     <w:p>
@@ -1153,7 +1165,7 @@
           <w:szCs w:val="32"/>
           <w:lang w:eastAsia="zh-HK"/>
         </w:rPr>
-        <w:t xml:space="preserve">प्रस्ताव नं. ३ ः आर्थिक वर्ष {{nextFiscalYear}} को लागि लेखापरीक्षक नियुक्ति सम्बन्धमा.</w:t>
+        <w:t>प्रस्ताव नं. ३ ः आर्थिक वर्ष {{nextFiscalYear}} को लागि लेखापरीक्षक नियुक्ति सम्बन्धमा.</w:t>
       </w:r>
     </w:p>
     <w:p>
@@ -1177,7 +1189,7 @@
           <w:szCs w:val="32"/>
           <w:lang w:eastAsia="zh-HK"/>
         </w:rPr>
-        <w:t xml:space="preserve">प्रस्ताव नं. ४ ः विविध .</w:t>
+        <w:t>प्रस्ताव नं. ४ ः विविध .</w:t>
       </w:r>
     </w:p>
     <w:p>
@@ -1201,7 +1213,7 @@
           <w:szCs w:val="32"/>
           <w:lang w:eastAsia="zh-HK"/>
         </w:rPr>
-        <w:t xml:space="preserve">निर्णयहरू ः</w:t>
+        <w:t>निर्णयहरू ः</w:t>
       </w:r>
     </w:p>
     <w:p>
@@ -1225,7 +1237,7 @@
           <w:szCs w:val="32"/>
           <w:lang w:eastAsia="zh-HK"/>
         </w:rPr>
-        <w:t xml:space="preserve">निर्णय नं.१ः यस कम्पनीको गतवर्ष भएको वार्षिक साधारण सभा पश्चात हालसम्म कम्पनीको तर्फबाट भए गरिएका नियमित कार्यहरूको सम्बन्धमा संचालक समितिको तर्फबाट अध्यक्षज्यूले तयार गरी पेश गर्नु भएको कम्पनीको हालसम्मको प्रगति प्रतिवेदन उपर छलफल गरी सो प्रगति प्रतिवेदन यस सभाबाट सर्वसम्मतिले अनुमोदन गरिएको छ .</w:t>
+        <w:t>निर्णय नं.१ः यस कम्पनीको गतवर्ष भएको वार्षिक साधारण सभा पश्चात हालसम्म कम्पनीको तर्फबाट भए गरिएका नियमित कार्यहरूको सम्बन्धमा संचालक समितिको तर्फबाट अध्यक्षज्यूले तयार गरी पेश गर्नु भएको कम्पनीको हालसम्मको प्रगति प्रतिवेदन उपर छलफल गरी सो प्रगति प्रतिवेदन यस सभाबाट सर्वसम्मतिले अनुमोदन गरिएको छ .</w:t>
       </w:r>
     </w:p>
     <w:p>
@@ -1282,7 +1294,7 @@
           <w:szCs w:val="32"/>
           <w:lang w:eastAsia="zh-HK"/>
         </w:rPr>
-        <w:t xml:space="preserve">निर्णय नं. २ः प्रस्ताव नं. २ माथि छलफछ गर्दा आ. व. २{{fiscalYear}} को लेखापरीक्षण प्रतिवेदनले कम्पनीको वास्तविक आर्थिक अवस्थाको चित्रण गरेको हुदा उक्त प्रतिवेदनलाई अनुमोदन गर्ने निर्णय गरियो .</w:t>
+        <w:t>निर्णय नं. २ः प्रस्ताव नं. २ माथि छलफछ गर्दा आ. व. २{{fiscalYear}} को लेखापरीक्षण प्रतिवेदनले कम्पनीको वास्तविक आर्थिक अवस्थाको चित्रण गरेको हुदा उक्त प्रतिवेदनलाई अनुमोदन गर्ने निर्णय गरियो .</w:t>
       </w:r>
     </w:p>
     <w:p>
@@ -1331,7 +1343,7 @@
           <w:sz w:val="32"/>
           <w:szCs w:val="32"/>
         </w:rPr>
-        <w:t xml:space="preserve">श्री {{auditorName}}लाई</w:t>
+        <w:t>श्री {{auditorName}}लाई</w:t>
       </w:r>
       <w:r>
         <w:rPr>
@@ -1381,7 +1393,7 @@
           <w:szCs w:val="32"/>
           <w:lang w:eastAsia="zh-HK"/>
         </w:rPr>
-        <w:t xml:space="preserve">निर्णय नं. ४ ः प्रस्ताव नं. ४ माथि छलफल गर्दा अन्य छलफलको विषय नभएकोले आजको साधारण सभा विर्सजन गरियो .</w:t>
+        <w:t>निर्णय नं. ४ ः प्रस्ताव नं. ४ माथि छलफल गर्दा अन्य छलफलको विषय नभएकोले आजको साधारण सभा विर्सजन गरियो .</w:t>
       </w:r>
     </w:p>
     <w:p>
@@ -1413,7 +1425,6 @@
     </w:p>
     <w:p>
       <w:pPr>
-        <w:jc w:val="both"/>
         <w:rPr>
           <w:rFonts w:ascii="Mangal" w:hAnsi="Mangal"/>
           <w:b/>
@@ -1424,162 +1435,6 @@
     </w:p>
     <w:p>
       <w:pPr>
-        <w:jc w:val="both"/>
-        <w:rPr>
-          <w:rFonts w:ascii="Mangal" w:hAnsi="Mangal"/>
-          <w:b/>
-          <w:sz w:val="56"/>
-          <w:szCs w:val="56"/>
-        </w:rPr>
-      </w:pPr>
-    </w:p>
-    <w:p>
-      <w:pPr>
-        <w:jc w:val="both"/>
-        <w:rPr>
-          <w:rFonts w:ascii="Mangal" w:hAnsi="Mangal"/>
-          <w:b/>
-          <w:sz w:val="56"/>
-          <w:szCs w:val="56"/>
-        </w:rPr>
-      </w:pPr>
-    </w:p>
-    <w:p>
-      <w:pPr>
-        <w:jc w:val="both"/>
-        <w:rPr>
-          <w:rFonts w:ascii="Mangal" w:hAnsi="Mangal"/>
-          <w:b/>
-          <w:sz w:val="56"/>
-          <w:szCs w:val="56"/>
-        </w:rPr>
-      </w:pPr>
-    </w:p>
-    <w:p>
-      <w:pPr>
-        <w:jc w:val="both"/>
-        <w:rPr>
-          <w:rFonts w:ascii="Mangal" w:hAnsi="Mangal"/>
-          <w:b/>
-          <w:sz w:val="56"/>
-          <w:szCs w:val="56"/>
-        </w:rPr>
-      </w:pPr>
-    </w:p>
-    <w:p>
-      <w:pPr>
-        <w:jc w:val="both"/>
-        <w:rPr>
-          <w:rFonts w:ascii="Mangal" w:hAnsi="Mangal"/>
-          <w:b/>
-          <w:sz w:val="56"/>
-          <w:szCs w:val="56"/>
-        </w:rPr>
-      </w:pPr>
-    </w:p>
-    <w:p>
-      <w:pPr>
-        <w:jc w:val="both"/>
-        <w:rPr>
-          <w:rFonts w:ascii="Mangal" w:hAnsi="Mangal"/>
-          <w:b/>
-          <w:sz w:val="56"/>
-          <w:szCs w:val="56"/>
-        </w:rPr>
-      </w:pPr>
-    </w:p>
-    <w:p>
-      <w:pPr>
-        <w:tabs>
-          <w:tab w:val="left" w:pos="1695"/>
-          <w:tab w:val="center" w:pos="4680"/>
-        </w:tabs>
-        <w:rPr>
-          <w:rFonts w:ascii="Mangal" w:hAnsi="Mangal"/>
-          <w:b/>
-          <w:sz w:val="56"/>
-          <w:szCs w:val="56"/>
-        </w:rPr>
-      </w:pPr>
-    </w:p>
-    <w:p>
-      <w:pPr>
-        <w:tabs>
-          <w:tab w:val="left" w:pos="1695"/>
-          <w:tab w:val="center" w:pos="4680"/>
-        </w:tabs>
-        <w:jc w:val="center"/>
-        <w:rPr>
-          <w:rFonts w:ascii="Mangal" w:hAnsi="Mangal"/>
-          <w:b/>
-          <w:w w:val="110"/>
-          <w:sz w:val="48"/>
-          <w:szCs w:val="44"/>
-        </w:rPr>
-      </w:pPr>
-    </w:p>
-    <w:p>
-      <w:pPr>
-        <w:tabs>
-          <w:tab w:val="left" w:pos="1695"/>
-          <w:tab w:val="center" w:pos="4680"/>
-        </w:tabs>
-        <w:jc w:val="center"/>
-        <w:rPr>
-          <w:rFonts w:ascii="Mangal" w:hAnsi="Mangal"/>
-          <w:b/>
-          <w:w w:val="110"/>
-          <w:sz w:val="48"/>
-          <w:szCs w:val="44"/>
-        </w:rPr>
-      </w:pPr>
-    </w:p>
-    <w:p>
-      <w:pPr>
-        <w:tabs>
-          <w:tab w:val="left" w:pos="1695"/>
-          <w:tab w:val="center" w:pos="4680"/>
-        </w:tabs>
-        <w:jc w:val="center"/>
-        <w:rPr>
-          <w:rFonts w:ascii="Mangal" w:hAnsi="Mangal"/>
-          <w:b/>
-          <w:w w:val="110"/>
-          <w:sz w:val="48"/>
-          <w:szCs w:val="44"/>
-        </w:rPr>
-      </w:pPr>
-    </w:p>
-    <w:p>
-      <w:pPr>
-        <w:tabs>
-          <w:tab w:val="left" w:pos="1695"/>
-          <w:tab w:val="center" w:pos="4680"/>
-        </w:tabs>
-        <w:jc w:val="center"/>
-        <w:rPr>
-          <w:rFonts w:ascii="Mangal" w:hAnsi="Mangal"/>
-          <w:b/>
-          <w:w w:val="110"/>
-          <w:sz w:val="48"/>
-          <w:szCs w:val="44"/>
-        </w:rPr>
-      </w:pPr>
-    </w:p>
-    <w:p>
-      <w:pPr>
-        <w:rPr>
-          <w:rFonts w:ascii="Mangal" w:hAnsi="Mangal"/>
-          <w:b/>
-          <w:w w:val="110"/>
-          <w:sz w:val="48"/>
-          <w:szCs w:val="44"/>
-        </w:rPr>
-      </w:pPr>
-    </w:p>
-    <w:p>
-      <w:pPr>
-        <w:jc w:val="center"/>
         <w:rPr>
           <w:rFonts w:ascii="Mangal" w:hAnsi="Mangal"/>
           <w:b/>
@@ -1595,7 +1450,64 @@
           <w:sz w:val="74"/>
           <w:szCs w:val="8"/>
         </w:rPr>
-        <w:t xml:space="preserve">{{companyName}}प्रा.लि.</w:t>
+        <w:lastRenderedPageBreak/>
+        <w:t>{{</w:t>
+      </w:r>
+      <w:proofErr w:type="spellStart"/>
+      <w:r>
+        <w:rPr>
+          <w:rFonts w:ascii="Mangal" w:hAnsi="Mangal"/>
+          <w:b/>
+          <w:bCs/>
+          <w:sz w:val="74"/>
+          <w:szCs w:val="8"/>
+        </w:rPr>
+        <w:t>companyName</w:t>
+      </w:r>
+      <w:proofErr w:type="spellEnd"/>
+      <w:proofErr w:type="gramStart"/>
+      <w:r>
+        <w:rPr>
+          <w:rFonts w:ascii="Mangal" w:hAnsi="Mangal"/>
+          <w:b/>
+          <w:bCs/>
+          <w:sz w:val="74"/>
+          <w:szCs w:val="8"/>
+        </w:rPr>
+        <w:t>}}</w:t>
+      </w:r>
+      <w:proofErr w:type="spellStart"/>
+      <w:r>
+        <w:rPr>
+          <w:rFonts w:ascii="Mangal" w:hAnsi="Mangal"/>
+          <w:b/>
+          <w:bCs/>
+          <w:sz w:val="74"/>
+          <w:szCs w:val="8"/>
+        </w:rPr>
+        <w:t>प्रा</w:t>
+      </w:r>
+      <w:proofErr w:type="gramEnd"/>
+      <w:r>
+        <w:rPr>
+          <w:rFonts w:ascii="Mangal" w:hAnsi="Mangal"/>
+          <w:b/>
+          <w:bCs/>
+          <w:sz w:val="74"/>
+          <w:szCs w:val="8"/>
+        </w:rPr>
+        <w:t>.लि</w:t>
+      </w:r>
+      <w:proofErr w:type="spellEnd"/>
+      <w:r>
+        <w:rPr>
+          <w:rFonts w:ascii="Mangal" w:hAnsi="Mangal"/>
+          <w:b/>
+          <w:bCs/>
+          <w:sz w:val="74"/>
+          <w:szCs w:val="8"/>
+        </w:rPr>
+        <w:t>.</w:t>
       </w:r>
     </w:p>
     <w:p>
@@ -1620,7 +1532,7 @@
           <w:szCs w:val="32"/>
           <w:lang w:eastAsia="zh-HK"/>
         </w:rPr>
-        <w:t xml:space="preserve">कम्पनीऐन २०६३ को दफा ५१ कावमोजिम पेश गरेको प्रतिवेदन</w:t>
+        <w:t>कम्पनीऐन २०६३ को दफा ५१ कावमोजिम पेश गरेको प्रतिवेदन</w:t>
       </w:r>
     </w:p>
     <w:p>
@@ -1650,10 +1562,10 @@
         <w:tblLook w:val="01E0" w:firstRow="1" w:lastRow="1" w:firstColumn="1" w:lastColumn="1" w:noHBand="0" w:noVBand="0"/>
       </w:tblPr>
       <w:tblGrid>
-        <w:gridCol w:w="850"/>
-        <w:gridCol w:w="4310"/>
-        <w:gridCol w:w="960"/>
-        <w:gridCol w:w="3000"/>
+        <w:gridCol w:w="871"/>
+        <w:gridCol w:w="3832"/>
+        <w:gridCol w:w="936"/>
+        <w:gridCol w:w="3603"/>
       </w:tblGrid>
       <w:tr>
         <w:trPr>
@@ -1679,7 +1591,7 @@
                 <w:szCs w:val="32"/>
                 <w:lang w:eastAsia="zh-HK"/>
               </w:rPr>
-              <w:t xml:space="preserve">-क_</w:t>
+              <w:t>-क_</w:t>
             </w:r>
           </w:p>
         </w:tc>
@@ -1703,7 +1615,7 @@
                 <w:szCs w:val="32"/>
                 <w:lang w:eastAsia="zh-HK"/>
               </w:rPr>
-              <w:t xml:space="preserve">कम्पनीको अधिकृत पुँजी र शेयरको संख्या</w:t>
+              <w:t>कम्पनीको अधिकृत पुँजी र शेयरको संख्या</w:t>
             </w:r>
           </w:p>
           <w:p>
@@ -1737,7 +1649,7 @@
                 <w:szCs w:val="32"/>
                 <w:lang w:eastAsia="zh-HK"/>
               </w:rPr>
-              <w:t xml:space="preserve">-क_</w:t>
+              <w:t>-क_</w:t>
             </w:r>
           </w:p>
         </w:tc>
@@ -1761,7 +1673,7 @@
                 <w:szCs w:val="32"/>
                 <w:lang w:eastAsia="zh-HK"/>
               </w:rPr>
-              <w:t xml:space="preserve">अधिकृत पुँजी रू{{authorizedCapital}}र शेयर संख्या२,००,०००थान</w:t>
+              <w:t>अधिकृत पुँजी रू{{authorizedCapital}}र शेयर संख्या२,००,०००थान</w:t>
             </w:r>
           </w:p>
         </w:tc>
@@ -1790,7 +1702,7 @@
                 <w:szCs w:val="32"/>
                 <w:lang w:eastAsia="zh-HK"/>
               </w:rPr>
-              <w:t xml:space="preserve">-ख_</w:t>
+              <w:t>-ख_</w:t>
             </w:r>
           </w:p>
         </w:tc>
@@ -1814,7 +1726,7 @@
                 <w:szCs w:val="32"/>
                 <w:lang w:eastAsia="zh-HK"/>
               </w:rPr>
-              <w:t xml:space="preserve">कम्पनीको जारी शेयर पुँजी</w:t>
+              <w:t>कम्पनीको जारी शेयर पुँजी</w:t>
             </w:r>
           </w:p>
           <w:p>
@@ -1848,7 +1760,7 @@
                 <w:szCs w:val="32"/>
                 <w:lang w:eastAsia="zh-HK"/>
               </w:rPr>
-              <w:t xml:space="preserve">-ख_</w:t>
+              <w:t>-ख_</w:t>
             </w:r>
           </w:p>
         </w:tc>
@@ -1872,7 +1784,7 @@
                 <w:szCs w:val="32"/>
                 <w:lang w:eastAsia="zh-HK"/>
               </w:rPr>
-              <w:t xml:space="preserve">रू {{issuedCapital}}.–</w:t>
+              <w:t>रू {{issuedCapital}}.–</w:t>
             </w:r>
           </w:p>
         </w:tc>
@@ -1925,7 +1837,7 @@
                 <w:szCs w:val="32"/>
                 <w:lang w:eastAsia="zh-HK"/>
               </w:rPr>
-              <w:t xml:space="preserve">कम्पनीको चुक्तापूँजी</w:t>
+              <w:t>कम्पनीको चुक्तापूँजी</w:t>
             </w:r>
           </w:p>
           <w:p>
@@ -1959,7 +1871,7 @@
                 <w:szCs w:val="32"/>
                 <w:lang w:eastAsia="zh-HK"/>
               </w:rPr>
-              <w:t xml:space="preserve">-ग_</w:t>
+              <w:t>-ग_</w:t>
             </w:r>
           </w:p>
         </w:tc>
@@ -1983,7 +1895,7 @@
                 <w:szCs w:val="32"/>
                 <w:lang w:eastAsia="zh-HK"/>
               </w:rPr>
-              <w:t xml:space="preserve">रू {{paidUpCapital}}.–</w:t>
+              <w:t>रू {{paidUpCapital}}.–</w:t>
             </w:r>
           </w:p>
         </w:tc>
@@ -2012,7 +1924,7 @@
                 <w:szCs w:val="32"/>
                 <w:lang w:eastAsia="zh-HK"/>
               </w:rPr>
-              <w:t xml:space="preserve">-घ_</w:t>
+              <w:t>-घ_</w:t>
             </w:r>
           </w:p>
         </w:tc>
@@ -2036,7 +1948,7 @@
                 <w:szCs w:val="32"/>
                 <w:lang w:eastAsia="zh-HK"/>
               </w:rPr>
-              <w:t xml:space="preserve">शेयर पिच्छे मागभएको रकम</w:t>
+              <w:t>शेयर पिच्छे मागभएको रकम</w:t>
             </w:r>
           </w:p>
           <w:p>
@@ -2070,7 +1982,7 @@
                 <w:szCs w:val="32"/>
                 <w:lang w:eastAsia="zh-HK"/>
               </w:rPr>
-              <w:t xml:space="preserve">-घ_</w:t>
+              <w:t>-घ_</w:t>
             </w:r>
           </w:p>
         </w:tc>
@@ -2094,7 +2006,7 @@
                 <w:szCs w:val="32"/>
                 <w:lang w:eastAsia="zh-HK"/>
               </w:rPr>
-              <w:t xml:space="preserve">रू १००.–</w:t>
+              <w:t>रू १००.–</w:t>
             </w:r>
           </w:p>
         </w:tc>
@@ -2123,7 +2035,7 @@
                 <w:szCs w:val="32"/>
                 <w:lang w:eastAsia="zh-HK"/>
               </w:rPr>
-              <w:t xml:space="preserve">-ङ_</w:t>
+              <w:t>-ङ_</w:t>
             </w:r>
           </w:p>
         </w:tc>
@@ -2147,7 +2059,7 @@
                 <w:szCs w:val="32"/>
                 <w:lang w:eastAsia="zh-HK"/>
               </w:rPr>
-              <w:t xml:space="preserve">किस्ताअसुलभएको जम्मा रकम</w:t>
+              <w:t>किस्ताअसुलभएको जम्मा रकम</w:t>
             </w:r>
           </w:p>
           <w:p>
@@ -2181,7 +2093,7 @@
                 <w:szCs w:val="32"/>
                 <w:lang w:eastAsia="zh-HK"/>
               </w:rPr>
-              <w:t xml:space="preserve">-ङ_</w:t>
+              <w:t>-ङ_</w:t>
             </w:r>
           </w:p>
         </w:tc>
@@ -2205,7 +2117,7 @@
                 <w:szCs w:val="32"/>
                 <w:lang w:eastAsia="zh-HK"/>
               </w:rPr>
-              <w:t xml:space="preserve">रू १,००,००,०००.–</w:t>
+              <w:t>रू १,००,००,०००.–</w:t>
             </w:r>
           </w:p>
         </w:tc>
@@ -2234,7 +2146,7 @@
                 <w:szCs w:val="32"/>
                 <w:lang w:eastAsia="zh-HK"/>
               </w:rPr>
-              <w:t xml:space="preserve">-च_</w:t>
+              <w:t>-च_</w:t>
             </w:r>
           </w:p>
         </w:tc>
@@ -2258,7 +2170,7 @@
                 <w:szCs w:val="32"/>
                 <w:lang w:eastAsia="zh-HK"/>
               </w:rPr>
-              <w:t xml:space="preserve">असुल हुन बाँकी रहेको जम्मा रकम</w:t>
+              <w:t>असुल हुन बाँकी रहेको जम्मा रकम</w:t>
             </w:r>
           </w:p>
           <w:p>
@@ -2292,7 +2204,7 @@
                 <w:szCs w:val="32"/>
                 <w:lang w:eastAsia="zh-HK"/>
               </w:rPr>
-              <w:t xml:space="preserve">-च_</w:t>
+              <w:t>-च_</w:t>
             </w:r>
           </w:p>
         </w:tc>
@@ -2316,7 +2228,7 @@
                 <w:szCs w:val="32"/>
                 <w:lang w:eastAsia="zh-HK"/>
               </w:rPr>
-              <w:t xml:space="preserve">छैन .</w:t>
+              <w:t>छैन .</w:t>
             </w:r>
           </w:p>
         </w:tc>
@@ -2345,7 +2257,7 @@
                 <w:szCs w:val="32"/>
                 <w:lang w:eastAsia="zh-HK"/>
               </w:rPr>
-              <w:t xml:space="preserve">-छ_</w:t>
+              <w:t>-छ_</w:t>
             </w:r>
           </w:p>
         </w:tc>
@@ -2369,7 +2281,7 @@
                 <w:szCs w:val="32"/>
                 <w:lang w:eastAsia="zh-HK"/>
               </w:rPr>
-              <w:t xml:space="preserve">शेयर र डिबेञ्चरमा दलाली दस्तुर बापत</w:t>
+              <w:t>शेयर र डिबेञ्चरमा दलाली दस्तुर बापत</w:t>
             </w:r>
           </w:p>
           <w:p>
@@ -2388,7 +2300,7 @@
                 <w:szCs w:val="32"/>
                 <w:lang w:eastAsia="zh-HK"/>
               </w:rPr>
-              <w:t xml:space="preserve">दिएको जम्मा रकम</w:t>
+              <w:t>दिएको जम्मा रकम</w:t>
             </w:r>
           </w:p>
           <w:p>
@@ -2422,7 +2334,7 @@
                 <w:szCs w:val="32"/>
                 <w:lang w:eastAsia="zh-HK"/>
               </w:rPr>
-              <w:t xml:space="preserve">-छ_</w:t>
+              <w:t>-छ_</w:t>
             </w:r>
           </w:p>
         </w:tc>
@@ -2446,7 +2358,7 @@
                 <w:szCs w:val="32"/>
                 <w:lang w:eastAsia="zh-HK"/>
               </w:rPr>
-              <w:t xml:space="preserve">छैन .</w:t>
+              <w:t>छैन .</w:t>
             </w:r>
           </w:p>
         </w:tc>
@@ -2475,7 +2387,8 @@
                 <w:szCs w:val="32"/>
                 <w:lang w:eastAsia="zh-HK"/>
               </w:rPr>
-              <w:t xml:space="preserve">-ज_</w:t>
+              <w:lastRenderedPageBreak/>
+              <w:t>-ज_</w:t>
             </w:r>
           </w:p>
         </w:tc>
@@ -2499,7 +2412,7 @@
                 <w:szCs w:val="32"/>
                 <w:lang w:eastAsia="zh-HK"/>
               </w:rPr>
-              <w:t xml:space="preserve">कुनै शेयर जफत गरिएकोमा त्यस्तो शेयरको जम्मा संख्या, जफत भएको कारण र मिति</w:t>
+              <w:t>कुनै शेयर जफत गरिएकोमा त्यस्तो शेयरको जम्मा संख्या, जफत भएको कारण र मिति</w:t>
             </w:r>
           </w:p>
           <w:p>
@@ -2533,7 +2446,7 @@
                 <w:szCs w:val="32"/>
                 <w:lang w:eastAsia="zh-HK"/>
               </w:rPr>
-              <w:t xml:space="preserve">-ज_</w:t>
+              <w:t>-ज_</w:t>
             </w:r>
           </w:p>
         </w:tc>
@@ -2557,7 +2470,7 @@
                 <w:szCs w:val="32"/>
                 <w:lang w:eastAsia="zh-HK"/>
               </w:rPr>
-              <w:t xml:space="preserve">छैन .</w:t>
+              <w:t>छैन .</w:t>
             </w:r>
           </w:p>
         </w:tc>
@@ -2586,7 +2499,7 @@
                 <w:szCs w:val="32"/>
                 <w:lang w:eastAsia="zh-HK"/>
               </w:rPr>
-              <w:t xml:space="preserve">-झ_</w:t>
+              <w:t>-झ_</w:t>
             </w:r>
           </w:p>
         </w:tc>
@@ -2610,7 +2523,7 @@
                 <w:szCs w:val="32"/>
                 <w:lang w:eastAsia="zh-HK"/>
               </w:rPr>
-              <w:t xml:space="preserve">बैक,वित्तिय संस्था वा अन्य कुनै व्यक्तिबाट लिएको ऋणा वा कम्पनीले दिएको जमानत</w:t>
+              <w:t>बैक,वित्तिय संस्था वा अन्य कुनै व्यक्तिबाट लिएको ऋणा वा कम्पनीले दिएको जमानत</w:t>
             </w:r>
           </w:p>
         </w:tc>
@@ -2634,7 +2547,7 @@
                 <w:szCs w:val="32"/>
                 <w:lang w:eastAsia="zh-HK"/>
               </w:rPr>
-              <w:t xml:space="preserve">-झ_</w:t>
+              <w:t>-झ_</w:t>
             </w:r>
           </w:p>
         </w:tc>
@@ -2658,7 +2571,7 @@
                 <w:szCs w:val="32"/>
                 <w:lang w:eastAsia="zh-HK"/>
               </w:rPr>
-              <w:t xml:space="preserve">आय व्यय विवरणमा उल्लेख भए बमोजिम</w:t>
+              <w:t>आय व्यय विवरणमा उल्लेख भए बमोजिम</w:t>
             </w:r>
           </w:p>
         </w:tc>
@@ -2686,7 +2599,7 @@
                 <w:szCs w:val="32"/>
                 <w:lang w:eastAsia="zh-HK"/>
               </w:rPr>
-              <w:t xml:space="preserve">-झ_१</w:t>
+              <w:t>-झ_१</w:t>
             </w:r>
           </w:p>
         </w:tc>
@@ -2709,7 +2622,7 @@
                 <w:sz w:val="34"/>
                 <w:szCs w:val="40"/>
               </w:rPr>
-              <w:t xml:space="preserve">अन्य कम्पनीको शेयर वा डिवेञ्चरमा लगानी गरेको भए त्यस्तो कम्पनीको नाम र दर्ता नं. तथा शेयर वा डिवेञ्चरमा गरेको लगानी रकम</w:t>
+              <w:t>अन्य कम्पनीको शेयर वा डिवेञ्चरमा लगानी गरेको भए त्यस्तो कम्पनीको नाम र दर्ता नं. तथा शेयर वा डिवेञ्चरमा गरेको लगानी रकम</w:t>
             </w:r>
           </w:p>
         </w:tc>
@@ -2733,7 +2646,7 @@
                 <w:szCs w:val="32"/>
                 <w:lang w:eastAsia="zh-HK"/>
               </w:rPr>
-              <w:t xml:space="preserve">-झ_१</w:t>
+              <w:t>-झ_१</w:t>
             </w:r>
           </w:p>
         </w:tc>
@@ -2757,7 +2670,7 @@
                 <w:szCs w:val="32"/>
                 <w:lang w:eastAsia="zh-HK"/>
               </w:rPr>
-              <w:t xml:space="preserve">छैन .</w:t>
+              <w:t>छैन .</w:t>
             </w:r>
           </w:p>
         </w:tc>
@@ -2786,7 +2699,7 @@
                 <w:szCs w:val="32"/>
                 <w:lang w:eastAsia="zh-HK"/>
               </w:rPr>
-              <w:t xml:space="preserve">-ञ_</w:t>
+              <w:t>-ञ_</w:t>
             </w:r>
           </w:p>
         </w:tc>
@@ -2810,7 +2723,7 @@
                 <w:szCs w:val="32"/>
                 <w:lang w:eastAsia="zh-HK"/>
               </w:rPr>
-              <w:t xml:space="preserve">बहालवाला सञ्चालकको नाम र ठेगाना</w:t>
+              <w:t>बहालवाला सञ्चालकको नाम र ठेगाना</w:t>
             </w:r>
           </w:p>
         </w:tc>
@@ -2863,7 +2776,7 @@
                 <w:szCs w:val="32"/>
                 <w:lang w:eastAsia="zh-HK"/>
               </w:rPr>
-              <w:t xml:space="preserve">सञ्चालक</w:t>
+              <w:t>सञ्चालक</w:t>
             </w:r>
             <w:r>
               <w:rPr>
@@ -2881,7 +2794,7 @@
                 <w:szCs w:val="32"/>
                 <w:lang w:eastAsia="zh-HK"/>
               </w:rPr>
-              <w:t xml:space="preserve">उल्लेख भए बमोजिम</w:t>
+              <w:t>उल्लेख भए बमोजिम</w:t>
             </w:r>
           </w:p>
           <w:p>
@@ -2908,26 +2821,13 @@
           <w:tab w:val="left" w:pos="720"/>
         </w:tabs>
         <w:spacing w:line="360" w:lineRule="auto"/>
-        <w:ind w:left="6120"/>
         <w:jc w:val="both"/>
         <w:rPr>
-          <w:rFonts w:ascii="Mangal" w:hAnsi="Mangal"/>
-          <w:b/>
-          <w:color w:val="000000" w:themeColor="text1"/>
-          <w:sz w:val="32"/>
-          <w:szCs w:val="32"/>
-        </w:rPr>
-      </w:pPr>
-      <w:r>
-        <w:rPr>
           <w:rFonts w:ascii="Mangal" w:eastAsia="PMingLiU" w:hAnsi="Mangal"/>
           <w:b/>
-          <w:sz w:val="32"/>
-          <w:szCs w:val="32"/>
-          <w:lang w:eastAsia="zh-HK"/>
-        </w:rPr>
-        <w:t xml:space="preserve">..............................</w:t>
-      </w:r>
+          <w:lang w:eastAsia="zh-HK"/>
+        </w:rPr>
+      </w:pPr>
     </w:p>
     <w:p>
       <w:pPr>
@@ -2937,20 +2837,875 @@
         <w:spacing w:line="360" w:lineRule="auto"/>
         <w:jc w:val="both"/>
         <w:rPr>
-          <w:rFonts w:ascii="Mangal" w:hAnsi="Mangal"/>
-          <w:b/>
-          <w:sz w:val="32"/>
-          <w:szCs w:val="32"/>
-        </w:rPr>
-      </w:pPr>
-      <w:r>
+          <w:rFonts w:ascii="Mangal" w:eastAsia="PMingLiU" w:hAnsi="Mangal"/>
+          <w:b/>
+          <w:lang w:eastAsia="zh-HK"/>
+        </w:rPr>
+      </w:pPr>
+      <w:r>
+        <w:rPr>
+          <w:rFonts w:ascii="Mangal" w:eastAsia="PMingLiU" w:hAnsi="Mangal"/>
+          <w:b/>
+          <w:lang w:eastAsia="zh-HK"/>
+        </w:rPr>
+        <w:t>..............................</w:t>
+      </w:r>
+    </w:p>
+    <w:p>
+      <w:pPr>
+        <w:tabs>
+          <w:tab w:val="left" w:pos="720"/>
+        </w:tabs>
+        <w:spacing w:line="360" w:lineRule="auto"/>
+        <w:jc w:val="both"/>
         <w:rPr>
           <w:rFonts w:ascii="Mangal" w:hAnsi="Mangal"/>
           <w:b/>
           <w:sz w:val="36"/>
           <w:szCs w:val="36"/>
         </w:rPr>
-        <w:t xml:space="preserve">                               {{chairmanName}}</w:t>
+      </w:pPr>
+      <w:r>
+        <w:rPr>
+          <w:rFonts w:ascii="Mangal" w:hAnsi="Mangal"/>
+          <w:b/>
+          <w:sz w:val="36"/>
+          <w:szCs w:val="36"/>
+        </w:rPr>
+        <w:t xml:space="preserve"> {{</w:t>
+      </w:r>
+      <w:proofErr w:type="spellStart"/>
+      <w:r>
+        <w:rPr>
+          <w:rFonts w:ascii="Mangal" w:hAnsi="Mangal"/>
+          <w:b/>
+          <w:sz w:val="36"/>
+          <w:szCs w:val="36"/>
+        </w:rPr>
+        <w:t>chairmanName</w:t>
+      </w:r>
+      <w:proofErr w:type="spellEnd"/>
+      <w:r>
+        <w:rPr>
+          <w:rFonts w:ascii="Mangal" w:hAnsi="Mangal"/>
+          <w:b/>
+          <w:sz w:val="36"/>
+          <w:szCs w:val="36"/>
+        </w:rPr>
+        <w:t>}}</w:t>
+      </w:r>
+      <w:r>
+        <w:rPr>
+          <w:rFonts w:ascii="Mangal" w:hAnsi="Mangal"/>
+          <w:b/>
+          <w:sz w:val="36"/>
+          <w:szCs w:val="36"/>
+        </w:rPr>
+        <w:t xml:space="preserve">                                   </w:t>
+      </w:r>
+    </w:p>
+    <w:p>
+      <w:pPr>
+        <w:tabs>
+          <w:tab w:val="left" w:pos="720"/>
+        </w:tabs>
+        <w:spacing w:line="360" w:lineRule="auto"/>
+        <w:jc w:val="both"/>
+        <w:rPr>
+          <w:rFonts w:ascii="Mangal" w:hAnsi="Mangal"/>
+          <w:b/>
+          <w:sz w:val="36"/>
+          <w:szCs w:val="36"/>
+        </w:rPr>
+      </w:pPr>
+      <w:proofErr w:type="spellStart"/>
+      <w:r>
+        <w:rPr>
+          <w:rFonts w:ascii="Mangal" w:hAnsi="Mangal"/>
+          <w:b/>
+          <w:sz w:val="32"/>
+          <w:szCs w:val="32"/>
+        </w:rPr>
+        <w:t>अध्यक्ष</w:t>
+      </w:r>
+      <w:proofErr w:type="spellEnd"/>
+    </w:p>
+    <w:p>
+      <w:pPr>
+        <w:jc w:val="center"/>
+        <w:rPr>
+          <w:rFonts w:ascii="Mangal" w:hAnsi="Mangal"/>
+          <w:b/>
+          <w:sz w:val="74"/>
+          <w:szCs w:val="8"/>
+        </w:rPr>
+      </w:pPr>
+      <w:r>
+        <w:rPr>
+          <w:rFonts w:ascii="Mangal" w:hAnsi="Mangal"/>
+          <w:b/>
+          <w:bCs/>
+          <w:sz w:val="74"/>
+          <w:szCs w:val="8"/>
+        </w:rPr>
+        <w:lastRenderedPageBreak/>
+        <w:t>{{</w:t>
+      </w:r>
+      <w:proofErr w:type="spellStart"/>
+      <w:r>
+        <w:rPr>
+          <w:rFonts w:ascii="Mangal" w:hAnsi="Mangal"/>
+          <w:b/>
+          <w:bCs/>
+          <w:sz w:val="74"/>
+          <w:szCs w:val="8"/>
+        </w:rPr>
+        <w:t>companyName</w:t>
+      </w:r>
+      <w:proofErr w:type="spellEnd"/>
+      <w:r>
+        <w:rPr>
+          <w:rFonts w:ascii="Mangal" w:hAnsi="Mangal"/>
+          <w:b/>
+          <w:bCs/>
+          <w:sz w:val="74"/>
+          <w:szCs w:val="8"/>
+        </w:rPr>
+        <w:t xml:space="preserve">}} </w:t>
+      </w:r>
+      <w:proofErr w:type="spellStart"/>
+      <w:r>
+        <w:rPr>
+          <w:rFonts w:ascii="Mangal" w:hAnsi="Mangal"/>
+          <w:b/>
+          <w:bCs/>
+          <w:sz w:val="74"/>
+          <w:szCs w:val="8"/>
+        </w:rPr>
+        <w:t>प्रा.लि</w:t>
+      </w:r>
+      <w:proofErr w:type="spellEnd"/>
+      <w:r>
+        <w:rPr>
+          <w:rFonts w:ascii="Mangal" w:hAnsi="Mangal"/>
+          <w:b/>
+          <w:bCs/>
+          <w:sz w:val="74"/>
+          <w:szCs w:val="8"/>
+        </w:rPr>
+        <w:t>.</w:t>
+      </w:r>
+    </w:p>
+    <w:p>
+      <w:pPr>
+        <w:ind w:left="2160" w:hanging="1080"/>
+        <w:rPr>
+          <w:rFonts w:ascii="Mangal" w:hAnsi="Mangal"/>
+          <w:sz w:val="36"/>
+          <w:szCs w:val="36"/>
+        </w:rPr>
+      </w:pPr>
+      <w:r>
+        <w:rPr>
+          <w:rFonts w:ascii="Mangal" w:hAnsi="Mangal"/>
+          <w:sz w:val="36"/>
+          <w:szCs w:val="36"/>
+        </w:rPr>
+        <w:t xml:space="preserve">                    </w:t>
+      </w:r>
+    </w:p>
+    <w:p>
+      <w:pPr>
+        <w:ind w:left="2160" w:hanging="1080"/>
+        <w:rPr>
+          <w:rFonts w:ascii="Mangal" w:hAnsi="Mangal"/>
+          <w:sz w:val="12"/>
+          <w:szCs w:val="12"/>
+        </w:rPr>
+      </w:pPr>
+      <w:r>
+        <w:rPr>
+          <w:rFonts w:ascii="Mangal" w:hAnsi="Mangal"/>
+          <w:sz w:val="36"/>
+          <w:szCs w:val="36"/>
+        </w:rPr>
+        <w:t xml:space="preserve">         </w:t>
+      </w:r>
+      <w:proofErr w:type="spellStart"/>
+      <w:proofErr w:type="gramStart"/>
+      <w:r>
+        <w:rPr>
+          <w:rFonts w:ascii="Mangal" w:hAnsi="Mangal"/>
+          <w:sz w:val="36"/>
+          <w:szCs w:val="36"/>
+        </w:rPr>
+        <w:t>प्रा.लि</w:t>
+      </w:r>
+      <w:proofErr w:type="spellEnd"/>
+      <w:proofErr w:type="gramEnd"/>
+      <w:r>
+        <w:rPr>
+          <w:rFonts w:ascii="Mangal" w:hAnsi="Mangal"/>
+          <w:sz w:val="36"/>
+          <w:szCs w:val="36"/>
+        </w:rPr>
+        <w:t xml:space="preserve"> </w:t>
+      </w:r>
+      <w:proofErr w:type="spellStart"/>
+      <w:r>
+        <w:rPr>
+          <w:rFonts w:ascii="Mangal" w:hAnsi="Mangal"/>
+          <w:sz w:val="36"/>
+          <w:szCs w:val="36"/>
+        </w:rPr>
+        <w:t>दर्ता</w:t>
+      </w:r>
+      <w:proofErr w:type="spellEnd"/>
+      <w:r>
+        <w:rPr>
+          <w:rFonts w:ascii="Mangal" w:hAnsi="Mangal"/>
+          <w:sz w:val="36"/>
+          <w:szCs w:val="36"/>
+        </w:rPr>
+        <w:t xml:space="preserve"> न</w:t>
+      </w:r>
+      <w:r>
+        <w:rPr>
+          <w:rFonts w:ascii="Mangal" w:hAnsi="Mangal"/>
+          <w:sz w:val="36"/>
+          <w:szCs w:val="36"/>
+        </w:rPr>
+        <w:t xml:space="preserve">      </w:t>
+      </w:r>
+      <w:r>
+        <w:rPr>
+          <w:rFonts w:ascii="Mangal" w:hAnsi="Mangal"/>
+          <w:sz w:val="36"/>
+          <w:szCs w:val="36"/>
+        </w:rPr>
+        <w:t xml:space="preserve"> {{</w:t>
+      </w:r>
+      <w:proofErr w:type="spellStart"/>
+      <w:r>
+        <w:rPr>
+          <w:rFonts w:ascii="Mangal" w:hAnsi="Mangal"/>
+          <w:sz w:val="36"/>
+          <w:szCs w:val="36"/>
+        </w:rPr>
+        <w:t>registrationNumber</w:t>
+      </w:r>
+      <w:proofErr w:type="spellEnd"/>
+      <w:r>
+        <w:rPr>
+          <w:rFonts w:ascii="Mangal" w:hAnsi="Mangal"/>
+          <w:sz w:val="36"/>
+          <w:szCs w:val="36"/>
+        </w:rPr>
+        <w:t xml:space="preserve">}} </w:t>
+      </w:r>
+    </w:p>
+    <w:p>
+      <w:pPr>
+        <w:ind w:left="2160" w:hanging="1080"/>
+        <w:rPr>
+          <w:rFonts w:ascii="Mangal" w:hAnsi="Mangal"/>
+          <w:sz w:val="12"/>
+          <w:szCs w:val="12"/>
+        </w:rPr>
+      </w:pPr>
+    </w:p>
+    <w:p>
+      <w:pPr>
+        <w:rPr>
+          <w:rFonts w:ascii="Mangal" w:hAnsi="Mangal"/>
+          <w:sz w:val="36"/>
+          <w:szCs w:val="36"/>
+        </w:rPr>
+      </w:pPr>
+    </w:p>
+    <w:p>
+      <w:pPr>
+        <w:ind w:left="6480" w:firstLine="720"/>
+        <w:rPr>
+          <w:rFonts w:ascii="Mangal" w:hAnsi="Mangal"/>
+          <w:sz w:val="36"/>
+          <w:szCs w:val="36"/>
+        </w:rPr>
+      </w:pPr>
+      <w:proofErr w:type="spellStart"/>
+      <w:r>
+        <w:rPr>
+          <w:rFonts w:ascii="Mangal" w:hAnsi="Mangal"/>
+          <w:sz w:val="32"/>
+          <w:szCs w:val="32"/>
+        </w:rPr>
+        <w:t>मिति</w:t>
+      </w:r>
+      <w:proofErr w:type="spellEnd"/>
+      <w:r>
+        <w:rPr>
+          <w:rFonts w:ascii="Mangal" w:hAnsi="Mangal"/>
+          <w:sz w:val="32"/>
+          <w:szCs w:val="32"/>
+        </w:rPr>
+        <w:t xml:space="preserve"> ः{{</w:t>
+      </w:r>
+      <w:proofErr w:type="spellStart"/>
+      <w:r>
+        <w:rPr>
+          <w:rFonts w:ascii="Mangal" w:hAnsi="Mangal"/>
+          <w:sz w:val="32"/>
+          <w:szCs w:val="32"/>
+        </w:rPr>
+        <w:t>letterDate</w:t>
+      </w:r>
+      <w:proofErr w:type="spellEnd"/>
+      <w:r>
+        <w:rPr>
+          <w:rFonts w:ascii="Mangal" w:hAnsi="Mangal"/>
+          <w:sz w:val="32"/>
+          <w:szCs w:val="32"/>
+        </w:rPr>
+        <w:t>}}</w:t>
+      </w:r>
+    </w:p>
+    <w:p>
+      <w:pPr>
+        <w:rPr>
+          <w:rFonts w:ascii="Mangal" w:hAnsi="Mangal"/>
+          <w:sz w:val="32"/>
+          <w:szCs w:val="32"/>
+        </w:rPr>
+      </w:pPr>
+    </w:p>
+    <w:p>
+      <w:pPr>
+        <w:rPr>
+          <w:rFonts w:ascii="Mangal" w:hAnsi="Mangal"/>
+          <w:sz w:val="32"/>
+          <w:szCs w:val="32"/>
+        </w:rPr>
+      </w:pPr>
+      <w:r>
+        <w:rPr>
+          <w:rFonts w:ascii="Mangal" w:hAnsi="Mangal"/>
+          <w:sz w:val="32"/>
+          <w:szCs w:val="32"/>
+        </w:rPr>
+        <w:t>श्रीमानकम्पनी रजिष्ट्रारज्यू,</w:t>
+      </w:r>
+    </w:p>
+    <w:p>
+      <w:pPr>
+        <w:rPr>
+          <w:rFonts w:ascii="Mangal" w:hAnsi="Mangal"/>
+          <w:sz w:val="32"/>
+          <w:szCs w:val="32"/>
+        </w:rPr>
+      </w:pPr>
+      <w:r>
+        <w:rPr>
+          <w:rFonts w:ascii="Mangal" w:hAnsi="Mangal"/>
+          <w:sz w:val="32"/>
+          <w:szCs w:val="32"/>
+        </w:rPr>
+        <w:t>कम्पनी रजिष्ट्रारको कार्यालय</w:t>
+      </w:r>
+    </w:p>
+    <w:p>
+      <w:pPr>
+        <w:rPr>
+          <w:rFonts w:ascii="Mangal" w:hAnsi="Mangal"/>
+          <w:sz w:val="32"/>
+          <w:szCs w:val="32"/>
+        </w:rPr>
+      </w:pPr>
+      <w:r>
+        <w:rPr>
+          <w:rFonts w:ascii="Mangal" w:hAnsi="Mangal"/>
+          <w:sz w:val="32"/>
+          <w:szCs w:val="32"/>
+        </w:rPr>
+        <w:t>त्रिपुरेश्वर, काठमाणडौ .</w:t>
+      </w:r>
+    </w:p>
+    <w:p>
+      <w:pPr>
+        <w:rPr>
+          <w:rFonts w:ascii="Mangal" w:hAnsi="Mangal"/>
+          <w:sz w:val="32"/>
+          <w:szCs w:val="32"/>
+        </w:rPr>
+      </w:pPr>
+    </w:p>
+    <w:p>
+      <w:pPr>
+        <w:rPr>
+          <w:rFonts w:ascii="Mangal" w:hAnsi="Mangal"/>
+          <w:sz w:val="32"/>
+          <w:szCs w:val="32"/>
+        </w:rPr>
+      </w:pPr>
+      <w:proofErr w:type="spellStart"/>
+      <w:r>
+        <w:rPr>
+          <w:rFonts w:ascii="Mangal" w:hAnsi="Mangal"/>
+          <w:sz w:val="32"/>
+          <w:szCs w:val="32"/>
+        </w:rPr>
+        <w:t>विषयःकम्पनीको</w:t>
+      </w:r>
+      <w:proofErr w:type="spellEnd"/>
+      <w:r>
+        <w:rPr>
+          <w:rFonts w:ascii="Mangal" w:hAnsi="Mangal"/>
+          <w:sz w:val="32"/>
+          <w:szCs w:val="32"/>
+        </w:rPr>
+        <w:t xml:space="preserve"> </w:t>
+      </w:r>
+      <w:proofErr w:type="spellStart"/>
+      <w:r>
+        <w:rPr>
+          <w:rFonts w:ascii="Mangal" w:hAnsi="Mangal"/>
+          <w:sz w:val="32"/>
+          <w:szCs w:val="32"/>
+        </w:rPr>
+        <w:t>साधरणा</w:t>
+      </w:r>
+      <w:proofErr w:type="spellEnd"/>
+      <w:r>
+        <w:rPr>
+          <w:rFonts w:ascii="Mangal" w:hAnsi="Mangal"/>
+          <w:sz w:val="32"/>
+          <w:szCs w:val="32"/>
+        </w:rPr>
+        <w:t xml:space="preserve"> </w:t>
+      </w:r>
+      <w:proofErr w:type="spellStart"/>
+      <w:r>
+        <w:rPr>
+          <w:rFonts w:ascii="Mangal" w:hAnsi="Mangal"/>
+          <w:sz w:val="32"/>
+          <w:szCs w:val="32"/>
+        </w:rPr>
+        <w:t>सभाको</w:t>
+      </w:r>
+      <w:proofErr w:type="spellEnd"/>
+      <w:r>
+        <w:rPr>
+          <w:rFonts w:ascii="Mangal" w:hAnsi="Mangal"/>
+          <w:sz w:val="32"/>
+          <w:szCs w:val="32"/>
+        </w:rPr>
+        <w:t xml:space="preserve"> </w:t>
+      </w:r>
+      <w:proofErr w:type="spellStart"/>
+      <w:r>
+        <w:rPr>
+          <w:rFonts w:ascii="Mangal" w:hAnsi="Mangal"/>
+          <w:sz w:val="32"/>
+          <w:szCs w:val="32"/>
+        </w:rPr>
+        <w:t>जानकारी</w:t>
+      </w:r>
+      <w:proofErr w:type="spellEnd"/>
+      <w:r>
+        <w:rPr>
+          <w:rFonts w:ascii="Mangal" w:hAnsi="Mangal"/>
+          <w:sz w:val="32"/>
+          <w:szCs w:val="32"/>
+        </w:rPr>
+        <w:t xml:space="preserve"> </w:t>
+      </w:r>
+      <w:proofErr w:type="gramStart"/>
+      <w:r>
+        <w:rPr>
+          <w:rFonts w:ascii="Mangal" w:hAnsi="Mangal"/>
+          <w:sz w:val="32"/>
+          <w:szCs w:val="32"/>
+        </w:rPr>
+        <w:t>बारे .</w:t>
+      </w:r>
+      <w:proofErr w:type="gramEnd"/>
+    </w:p>
+    <w:p>
+      <w:pPr>
+        <w:rPr>
+          <w:rFonts w:ascii="Mangal" w:hAnsi="Mangal"/>
+          <w:sz w:val="32"/>
+          <w:szCs w:val="32"/>
+        </w:rPr>
+      </w:pPr>
+    </w:p>
+    <w:p>
+      <w:pPr>
+        <w:rPr>
+          <w:rFonts w:ascii="Mangal" w:hAnsi="Mangal"/>
+          <w:sz w:val="32"/>
+          <w:szCs w:val="32"/>
+        </w:rPr>
+      </w:pPr>
+    </w:p>
+    <w:p>
+      <w:pPr>
+        <w:rPr>
+          <w:rFonts w:ascii="Mangal" w:hAnsi="Mangal"/>
+          <w:sz w:val="32"/>
+          <w:szCs w:val="32"/>
+        </w:rPr>
+      </w:pPr>
+      <w:proofErr w:type="spellStart"/>
+      <w:r>
+        <w:rPr>
+          <w:rFonts w:ascii="Mangal" w:hAnsi="Mangal"/>
+          <w:sz w:val="32"/>
+          <w:szCs w:val="32"/>
+        </w:rPr>
+        <w:t>महोदय</w:t>
+      </w:r>
+      <w:proofErr w:type="spellEnd"/>
+      <w:r>
+        <w:rPr>
+          <w:rFonts w:ascii="Mangal" w:hAnsi="Mangal"/>
+          <w:sz w:val="32"/>
+          <w:szCs w:val="32"/>
+        </w:rPr>
+        <w:t>,</w:t>
+      </w:r>
+    </w:p>
+    <w:p>
+      <w:pPr>
+        <w:rPr>
+          <w:rFonts w:ascii="Mangal" w:hAnsi="Mangal"/>
+          <w:sz w:val="32"/>
+          <w:szCs w:val="32"/>
+        </w:rPr>
+      </w:pPr>
+      <w:proofErr w:type="spellStart"/>
+      <w:r>
+        <w:rPr>
+          <w:rFonts w:ascii="Mangal" w:eastAsia="PMingLiU" w:hAnsi="Mangal"/>
+          <w:sz w:val="32"/>
+          <w:szCs w:val="32"/>
+          <w:lang w:eastAsia="zh-HK"/>
+        </w:rPr>
+        <w:t>उपरोक्त</w:t>
+      </w:r>
+      <w:proofErr w:type="spellEnd"/>
+      <w:r>
+        <w:rPr>
+          <w:rFonts w:ascii="Mangal" w:eastAsia="PMingLiU" w:hAnsi="Mangal"/>
+          <w:sz w:val="32"/>
+          <w:szCs w:val="32"/>
+          <w:lang w:eastAsia="zh-HK"/>
+        </w:rPr>
+        <w:t xml:space="preserve"> </w:t>
+      </w:r>
+      <w:proofErr w:type="spellStart"/>
+      <w:r>
+        <w:rPr>
+          <w:rFonts w:ascii="Mangal" w:eastAsia="PMingLiU" w:hAnsi="Mangal"/>
+          <w:sz w:val="32"/>
+          <w:szCs w:val="32"/>
+          <w:lang w:eastAsia="zh-HK"/>
+        </w:rPr>
+        <w:t>सम्वन्धमायस</w:t>
+      </w:r>
+      <w:proofErr w:type="spellEnd"/>
+      <w:r>
+        <w:rPr>
+          <w:rFonts w:ascii="Mangal" w:eastAsia="PMingLiU" w:hAnsi="Mangal"/>
+          <w:sz w:val="32"/>
+          <w:szCs w:val="32"/>
+          <w:lang w:eastAsia="zh-HK"/>
+        </w:rPr>
+        <w:t xml:space="preserve"> {{</w:t>
+      </w:r>
+      <w:proofErr w:type="spellStart"/>
+      <w:r>
+        <w:rPr>
+          <w:rFonts w:ascii="Mangal" w:eastAsia="PMingLiU" w:hAnsi="Mangal"/>
+          <w:sz w:val="32"/>
+          <w:szCs w:val="32"/>
+          <w:lang w:eastAsia="zh-HK"/>
+        </w:rPr>
+        <w:t>companyName</w:t>
+      </w:r>
+      <w:proofErr w:type="spellEnd"/>
+      <w:r>
+        <w:rPr>
+          <w:rFonts w:ascii="Mangal" w:eastAsia="PMingLiU" w:hAnsi="Mangal"/>
+          <w:sz w:val="32"/>
+          <w:szCs w:val="32"/>
+          <w:lang w:eastAsia="zh-HK"/>
+        </w:rPr>
+        <w:t xml:space="preserve">}} </w:t>
+      </w:r>
+      <w:proofErr w:type="spellStart"/>
+      <w:r>
+        <w:rPr>
+          <w:rFonts w:ascii="Mangal" w:eastAsia="PMingLiU" w:hAnsi="Mangal"/>
+          <w:sz w:val="32"/>
+          <w:szCs w:val="32"/>
+          <w:lang w:eastAsia="zh-HK"/>
+        </w:rPr>
+        <w:t>प्रा.लि</w:t>
+      </w:r>
+      <w:proofErr w:type="spellEnd"/>
+      <w:r>
+        <w:rPr>
+          <w:rFonts w:ascii="Mangal" w:hAnsi="Mangal"/>
+          <w:b/>
+          <w:sz w:val="74"/>
+          <w:szCs w:val="8"/>
+        </w:rPr>
+        <w:t>.</w:t>
+      </w:r>
+    </w:p>
+    <w:p>
+      <w:pPr>
+        <w:rPr>
+          <w:rFonts w:ascii="Mangal" w:hAnsi="Mangal"/>
+          <w:sz w:val="32"/>
+          <w:szCs w:val="32"/>
+        </w:rPr>
+      </w:pPr>
+      <w:proofErr w:type="spellStart"/>
+      <w:r>
+        <w:rPr>
+          <w:rFonts w:ascii="Mangal" w:hAnsi="Mangal"/>
+          <w:sz w:val="32"/>
+          <w:szCs w:val="32"/>
+        </w:rPr>
+        <w:t>को</w:t>
+      </w:r>
+      <w:proofErr w:type="spellEnd"/>
+      <w:r>
+        <w:rPr>
+          <w:rFonts w:ascii="Mangal" w:hAnsi="Mangal"/>
+          <w:sz w:val="32"/>
+          <w:szCs w:val="32"/>
+        </w:rPr>
+        <w:t xml:space="preserve"> </w:t>
+      </w:r>
+      <w:proofErr w:type="spellStart"/>
+      <w:r>
+        <w:rPr>
+          <w:rFonts w:ascii="Mangal" w:hAnsi="Mangal"/>
+          <w:sz w:val="32"/>
+          <w:szCs w:val="32"/>
+        </w:rPr>
+        <w:t>आ.व</w:t>
+      </w:r>
+      <w:proofErr w:type="spellEnd"/>
+      <w:r>
+        <w:rPr>
+          <w:rFonts w:ascii="Mangal" w:hAnsi="Mangal"/>
+          <w:sz w:val="32"/>
+          <w:szCs w:val="32"/>
+        </w:rPr>
+        <w:t xml:space="preserve"> {{</w:t>
+      </w:r>
+      <w:proofErr w:type="spellStart"/>
+      <w:r>
+        <w:rPr>
+          <w:rFonts w:ascii="Mangal" w:hAnsi="Mangal"/>
+          <w:sz w:val="32"/>
+          <w:szCs w:val="32"/>
+        </w:rPr>
+        <w:t>fiscalYear</w:t>
+      </w:r>
+      <w:proofErr w:type="spellEnd"/>
+      <w:r>
+        <w:rPr>
+          <w:rFonts w:ascii="Mangal" w:hAnsi="Mangal"/>
+          <w:sz w:val="32"/>
+          <w:szCs w:val="32"/>
+        </w:rPr>
+        <w:t xml:space="preserve">}} </w:t>
+      </w:r>
+      <w:proofErr w:type="spellStart"/>
+      <w:r>
+        <w:rPr>
+          <w:rFonts w:ascii="Mangal" w:hAnsi="Mangal"/>
+          <w:sz w:val="32"/>
+          <w:szCs w:val="32"/>
+        </w:rPr>
+        <w:t>को</w:t>
+      </w:r>
+      <w:proofErr w:type="spellEnd"/>
+      <w:r>
+        <w:rPr>
+          <w:rFonts w:ascii="Mangal" w:hAnsi="Mangal"/>
+          <w:sz w:val="32"/>
+          <w:szCs w:val="32"/>
+        </w:rPr>
+        <w:t xml:space="preserve"> साधारण सभा र लेखापरीक्षण प्रतिबेदन सहितदफा ५१ सहितयोनिवेदन पेश गरेको </w:t>
+      </w:r>
+      <w:proofErr w:type="gramStart"/>
+      <w:r>
+        <w:rPr>
+          <w:rFonts w:ascii="Mangal" w:hAnsi="Mangal"/>
+          <w:sz w:val="32"/>
+          <w:szCs w:val="32"/>
+        </w:rPr>
+        <w:t>छु .</w:t>
+      </w:r>
+      <w:proofErr w:type="gramEnd"/>
+    </w:p>
+    <w:p>
+      <w:pPr>
+        <w:autoSpaceDE w:val="0"/>
+        <w:autoSpaceDN w:val="0"/>
+        <w:adjustRightInd w:val="0"/>
+        <w:rPr>
+          <w:rFonts w:ascii="Mangal" w:hAnsi="Mangal"/>
+          <w:sz w:val="36"/>
+          <w:szCs w:val="36"/>
+          <w:u w:val="single"/>
+          <w:lang w:val="sv-SE"/>
+        </w:rPr>
+      </w:pPr>
+      <w:r>
+        <w:rPr>
+          <w:rFonts w:ascii="Mangal" w:hAnsi="Mangal"/>
+          <w:sz w:val="36"/>
+          <w:szCs w:val="36"/>
+          <w:u w:val="single"/>
+          <w:lang w:val="sv-SE"/>
+        </w:rPr>
+        <w:t>संलग्न कागजातहरूः</w:t>
+      </w:r>
+    </w:p>
+    <w:p>
+      <w:pPr>
+        <w:autoSpaceDE w:val="0"/>
+        <w:autoSpaceDN w:val="0"/>
+        <w:adjustRightInd w:val="0"/>
+        <w:rPr>
+          <w:rFonts w:ascii="Mangal" w:hAnsi="Mangal"/>
+          <w:sz w:val="36"/>
+          <w:szCs w:val="36"/>
+          <w:u w:val="single"/>
+          <w:lang w:val="sv-SE"/>
+        </w:rPr>
+      </w:pPr>
+      <w:r>
+        <w:rPr>
+          <w:rFonts w:ascii="Mangal" w:hAnsi="Mangal"/>
+          <w:sz w:val="36"/>
+          <w:szCs w:val="36"/>
+          <w:lang w:val="sv-SE"/>
+        </w:rPr>
+        <w:t xml:space="preserve">१.कम्पनीको लेखा परीक्षणा प्रतिवेदन </w:t>
+      </w:r>
+    </w:p>
+    <w:p>
+      <w:pPr>
+        <w:pStyle w:val="BodyTextIndent"/>
+        <w:tabs>
+          <w:tab w:val="left" w:pos="896"/>
+        </w:tabs>
+        <w:ind w:left="896" w:hanging="336"/>
+        <w:rPr>
+          <w:rFonts w:ascii="Mangal" w:hAnsi="Mangal"/>
+          <w:sz w:val="36"/>
+          <w:szCs w:val="36"/>
+          <w:lang w:val="sv-SE"/>
+        </w:rPr>
+      </w:pPr>
+      <w:r>
+        <w:rPr>
+          <w:rFonts w:ascii="Mangal" w:hAnsi="Mangal"/>
+          <w:sz w:val="36"/>
+          <w:szCs w:val="36"/>
+          <w:lang w:val="sv-SE"/>
+        </w:rPr>
+        <w:lastRenderedPageBreak/>
+        <w:t>२.कम्पनीको संचालक समितिको निर्णय</w:t>
+      </w:r>
+    </w:p>
+    <w:p>
+      <w:pPr>
+        <w:pStyle w:val="BodyTextIndent"/>
+        <w:tabs>
+          <w:tab w:val="left" w:pos="896"/>
+        </w:tabs>
+        <w:ind w:left="896" w:hanging="336"/>
+        <w:rPr>
+          <w:rFonts w:ascii="Mangal" w:hAnsi="Mangal"/>
+          <w:sz w:val="36"/>
+          <w:szCs w:val="36"/>
+          <w:lang w:val="sv-SE"/>
+        </w:rPr>
+      </w:pPr>
+      <w:r>
+        <w:rPr>
+          <w:rFonts w:ascii="Mangal" w:hAnsi="Mangal"/>
+          <w:sz w:val="36"/>
+          <w:szCs w:val="36"/>
+          <w:lang w:val="sv-SE"/>
+        </w:rPr>
+        <w:t>३.कम्पनीको वार्षिक साधारण सभाको निर्णय</w:t>
+      </w:r>
+    </w:p>
+    <w:p>
+      <w:pPr>
+        <w:pStyle w:val="BodyTextIndent"/>
+        <w:tabs>
+          <w:tab w:val="left" w:pos="896"/>
+        </w:tabs>
+        <w:ind w:left="896" w:hanging="336"/>
+        <w:rPr>
+          <w:rFonts w:ascii="Mangal" w:hAnsi="Mangal"/>
+          <w:sz w:val="36"/>
+          <w:szCs w:val="36"/>
+          <w:lang w:val="sv-SE"/>
+        </w:rPr>
+      </w:pPr>
+      <w:r>
+        <w:rPr>
+          <w:rFonts w:ascii="Mangal" w:hAnsi="Mangal"/>
+          <w:sz w:val="36"/>
+          <w:szCs w:val="36"/>
+          <w:lang w:val="sv-SE"/>
+        </w:rPr>
+        <w:t xml:space="preserve">४.कम्पनी ऐनको दफा ५१ नं. बमोजिमको विवरणा </w:t>
+      </w:r>
+    </w:p>
+    <w:p>
+      <w:pPr>
+        <w:pStyle w:val="BodyTextIndent"/>
+        <w:tabs>
+          <w:tab w:val="left" w:pos="896"/>
+        </w:tabs>
+        <w:rPr>
+          <w:rFonts w:ascii="Mangal" w:eastAsia="PMingLiU" w:hAnsi="Mangal" w:cs="Mangal"/>
+          <w:sz w:val="32"/>
+          <w:szCs w:val="32"/>
+          <w:lang w:eastAsia="zh-HK"/>
+        </w:rPr>
+      </w:pPr>
+    </w:p>
+    <w:p>
+      <w:pPr>
+        <w:jc w:val="right"/>
+        <w:rPr>
+          <w:rFonts w:ascii="Mangal" w:eastAsia="PMingLiU" w:hAnsi="Mangal" w:cs="Mangal"/>
+          <w:sz w:val="32"/>
+          <w:szCs w:val="32"/>
+          <w:lang w:eastAsia="zh-HK"/>
+        </w:rPr>
+      </w:pPr>
+      <w:r>
+        <w:rPr>
+          <w:rFonts w:ascii="Mangal" w:eastAsia="PMingLiU" w:hAnsi="Mangal"/>
+          <w:sz w:val="32"/>
+          <w:szCs w:val="32"/>
+          <w:lang w:eastAsia="zh-HK"/>
+        </w:rPr>
+        <w:t>.............................</w:t>
       </w:r>
     </w:p>
     <w:p>
@@ -2963,32 +3718,56 @@
         <w:rPr>
           <w:rFonts w:ascii="Mangal" w:hAnsi="Mangal"/>
           <w:b/>
-          <w:color w:val="000000" w:themeColor="text1"/>
-          <w:sz w:val="32"/>
-          <w:szCs w:val="32"/>
-        </w:rPr>
-      </w:pPr>
-      <w:r>
-        <w:rPr>
-          <w:rFonts w:ascii="Mangal" w:hAnsi="Mangal"/>
-          <w:b/>
-          <w:sz w:val="32"/>
-          <w:szCs w:val="32"/>
-        </w:rPr>
-        <w:t xml:space="preserve">अध्यक्ष</w:t>
-      </w:r>
-    </w:p>
-    <w:p>
-      <w:pPr>
+          <w:sz w:val="32"/>
+          <w:szCs w:val="32"/>
+        </w:rPr>
+      </w:pPr>
+      <w:r>
+        <w:rPr>
+          <w:rFonts w:ascii="Mangal" w:hAnsi="Mangal"/>
+          <w:b/>
+          <w:sz w:val="36"/>
+          <w:szCs w:val="36"/>
+        </w:rPr>
+        <w:t xml:space="preserve">                                                                  {{chairmanName}}</w:t>
+      </w:r>
+      <w:r>
+        <w:rPr>
+          <w:rFonts w:ascii="Mangal" w:hAnsi="Mangal"/>
+          <w:b/>
+          <w:sz w:val="32"/>
+          <w:szCs w:val="32"/>
+        </w:rPr>
+        <w:t>अध्यक्ष</w:t>
+      </w:r>
+    </w:p>
+    <w:p>
+      <w:pPr>
+        <w:spacing w:line="360" w:lineRule="atLeast"/>
         <w:jc w:val="center"/>
         <w:rPr>
           <w:rFonts w:ascii="Mangal" w:hAnsi="Mangal"/>
           <w:b/>
-          <w:sz w:val="74"/>
-          <w:szCs w:val="8"/>
-        </w:rPr>
-      </w:pPr>
-      <w:r>
+          <w:sz w:val="34"/>
+          <w:szCs w:val="34"/>
+        </w:rPr>
+      </w:pPr>
+    </w:p>
+    <w:p>
+      <w:pPr>
+        <w:spacing w:line="360" w:lineRule="atLeast"/>
+        <w:jc w:val="center"/>
+        <w:rPr>
+          <w:rFonts w:ascii="Mangal" w:hAnsi="Mangal"/>
+          <w:b/>
+          <w:sz w:val="34"/>
+          <w:szCs w:val="34"/>
+        </w:rPr>
+      </w:pPr>
+    </w:p>
+    <w:p>
+      <w:pPr>
+        <w:jc w:val="center"/>
         <w:rPr>
           <w:rFonts w:ascii="Mangal" w:hAnsi="Mangal"/>
           <w:b/>
@@ -2996,520 +3775,6 @@
           <w:sz w:val="74"/>
           <w:szCs w:val="8"/>
         </w:rPr>
-        <w:t xml:space="preserve">{{companyName}} प्रा.लि.</w:t>
-      </w:r>
-    </w:p>
-    <w:p>
-      <w:pPr>
-        <w:ind w:left="2160" w:hanging="1080"/>
-        <w:rPr>
-          <w:rFonts w:ascii="Mangal" w:hAnsi="Mangal"/>
-          <w:sz w:val="36"/>
-          <w:szCs w:val="36"/>
-        </w:rPr>
-      </w:pPr>
-      <w:r>
-        <w:rPr>
-          <w:rFonts w:ascii="Mangal" w:hAnsi="Mangal"/>
-          <w:sz w:val="36"/>
-          <w:szCs w:val="36"/>
-        </w:rPr>
-        <w:t xml:space="preserve">                    </w:t>
-      </w:r>
-    </w:p>
-    <w:p>
-      <w:pPr>
-        <w:ind w:left="2160" w:hanging="1080"/>
-        <w:rPr>
-          <w:rFonts w:ascii="Mangal" w:hAnsi="Mangal"/>
-          <w:sz w:val="12"/>
-          <w:szCs w:val="12"/>
-        </w:rPr>
-      </w:pPr>
-      <w:r>
-        <w:rPr>
-          <w:rFonts w:ascii="Mangal" w:hAnsi="Mangal"/>
-          <w:sz w:val="36"/>
-          <w:szCs w:val="36"/>
-        </w:rPr>
-        <w:t xml:space="preserve">                प्रा.लि दर्ता न {{registrationNumber}} </w:t>
-      </w:r>
-    </w:p>
-    <w:p>
-      <w:pPr>
-        <w:ind w:left="2160" w:hanging="1080"/>
-        <w:rPr>
-          <w:rFonts w:ascii="Mangal" w:hAnsi="Mangal"/>
-          <w:sz w:val="12"/>
-          <w:szCs w:val="12"/>
-        </w:rPr>
-      </w:pPr>
-    </w:p>
-    <w:p>
-      <w:pPr>
-        <w:rPr>
-          <w:rFonts w:ascii="Mangal" w:hAnsi="Mangal"/>
-          <w:sz w:val="36"/>
-          <w:szCs w:val="36"/>
-        </w:rPr>
-      </w:pPr>
-    </w:p>
-    <w:p>
-      <w:pPr>
-        <w:ind w:left="6480" w:firstLine="720"/>
-        <w:jc w:val="center"/>
-        <w:rPr>
-          <w:rFonts w:ascii="Mangal" w:hAnsi="Mangal"/>
-          <w:sz w:val="36"/>
-          <w:szCs w:val="36"/>
-        </w:rPr>
-      </w:pPr>
-      <w:r>
-        <w:rPr>
-          <w:rFonts w:ascii="Mangal" w:hAnsi="Mangal"/>
-          <w:sz w:val="32"/>
-          <w:szCs w:val="32"/>
-        </w:rPr>
-        <w:t xml:space="preserve">मिति ः{{letterDate}}</w:t>
-      </w:r>
-    </w:p>
-    <w:p>
-      <w:pPr>
-        <w:rPr>
-          <w:rFonts w:ascii="Mangal" w:hAnsi="Mangal"/>
-          <w:sz w:val="32"/>
-          <w:szCs w:val="32"/>
-        </w:rPr>
-      </w:pPr>
-    </w:p>
-    <w:p>
-      <w:pPr>
-        <w:rPr>
-          <w:rFonts w:ascii="Mangal" w:hAnsi="Mangal"/>
-          <w:sz w:val="32"/>
-          <w:szCs w:val="32"/>
-        </w:rPr>
-      </w:pPr>
-      <w:r>
-        <w:rPr>
-          <w:rFonts w:ascii="Mangal" w:hAnsi="Mangal"/>
-          <w:sz w:val="32"/>
-          <w:szCs w:val="32"/>
-        </w:rPr>
-        <w:t xml:space="preserve">श्रीमानकम्पनी रजिष्ट्रारज्यू,</w:t>
-      </w:r>
-    </w:p>
-    <w:p>
-      <w:pPr>
-        <w:rPr>
-          <w:rFonts w:ascii="Mangal" w:hAnsi="Mangal"/>
-          <w:sz w:val="32"/>
-          <w:szCs w:val="32"/>
-        </w:rPr>
-      </w:pPr>
-      <w:r>
-        <w:rPr>
-          <w:rFonts w:ascii="Mangal" w:hAnsi="Mangal"/>
-          <w:sz w:val="32"/>
-          <w:szCs w:val="32"/>
-        </w:rPr>
-        <w:t xml:space="preserve">कम्पनी रजिष्ट्रारको कार्यालय</w:t>
-      </w:r>
-    </w:p>
-    <w:p>
-      <w:pPr>
-        <w:rPr>
-          <w:rFonts w:ascii="Mangal" w:hAnsi="Mangal"/>
-          <w:sz w:val="32"/>
-          <w:szCs w:val="32"/>
-        </w:rPr>
-      </w:pPr>
-      <w:r>
-        <w:rPr>
-          <w:rFonts w:ascii="Mangal" w:hAnsi="Mangal"/>
-          <w:sz w:val="32"/>
-          <w:szCs w:val="32"/>
-        </w:rPr>
-        <w:t xml:space="preserve">त्रिपुरेश्वर, काठमाणडौ .</w:t>
-      </w:r>
-    </w:p>
-    <w:p>
-      <w:pPr>
-        <w:rPr>
-          <w:rFonts w:ascii="Mangal" w:hAnsi="Mangal"/>
-          <w:sz w:val="32"/>
-          <w:szCs w:val="32"/>
-        </w:rPr>
-      </w:pPr>
-    </w:p>
-    <w:p>
-      <w:pPr>
-        <w:rPr>
-          <w:rFonts w:ascii="Mangal" w:hAnsi="Mangal"/>
-          <w:sz w:val="32"/>
-          <w:szCs w:val="32"/>
-        </w:rPr>
-      </w:pPr>
-    </w:p>
-    <w:p>
-      <w:pPr>
-        <w:rPr>
-          <w:rFonts w:ascii="Mangal" w:hAnsi="Mangal"/>
-          <w:sz w:val="32"/>
-          <w:szCs w:val="32"/>
-        </w:rPr>
-      </w:pPr>
-      <w:r>
-        <w:rPr>
-          <w:rFonts w:ascii="Mangal" w:hAnsi="Mangal"/>
-          <w:sz w:val="32"/>
-          <w:szCs w:val="32"/>
-        </w:rPr>
-        <w:t xml:space="preserve">विषयःकम्पनीको साधरणा सभाको जानकारी बारे .</w:t>
-      </w:r>
-    </w:p>
-    <w:p>
-      <w:pPr>
-        <w:rPr>
-          <w:rFonts w:ascii="Mangal" w:hAnsi="Mangal"/>
-          <w:sz w:val="32"/>
-          <w:szCs w:val="32"/>
-        </w:rPr>
-      </w:pPr>
-    </w:p>
-    <w:p>
-      <w:pPr>
-        <w:rPr>
-          <w:rFonts w:ascii="Mangal" w:hAnsi="Mangal"/>
-          <w:sz w:val="32"/>
-          <w:szCs w:val="32"/>
-        </w:rPr>
-      </w:pPr>
-    </w:p>
-    <w:p>
-      <w:pPr>
-        <w:rPr>
-          <w:rFonts w:ascii="Mangal" w:hAnsi="Mangal"/>
-          <w:sz w:val="32"/>
-          <w:szCs w:val="32"/>
-        </w:rPr>
-      </w:pPr>
-      <w:r>
-        <w:rPr>
-          <w:rFonts w:ascii="Mangal" w:hAnsi="Mangal"/>
-          <w:sz w:val="32"/>
-          <w:szCs w:val="32"/>
-        </w:rPr>
-        <w:t xml:space="preserve">महोदय,</w:t>
-      </w:r>
-    </w:p>
-    <w:p>
-      <w:pPr>
-        <w:rPr>
-          <w:rFonts w:ascii="Mangal" w:hAnsi="Mangal"/>
-          <w:b/>
-          <w:sz w:val="74"/>
-          <w:szCs w:val="8"/>
-        </w:rPr>
-      </w:pPr>
-      <w:r>
-        <w:rPr>
-          <w:rFonts w:ascii="Mangal" w:eastAsia="PMingLiU" w:hAnsi="Mangal"/>
-          <w:sz w:val="32"/>
-          <w:szCs w:val="32"/>
-          <w:lang w:eastAsia="zh-HK"/>
-        </w:rPr>
-        <w:t xml:space="preserve">उपरोक्त सम्वन्धमायस {{companyName}} प्रा.लि</w:t>
-      </w:r>
-      <w:r>
-        <w:rPr>
-          <w:rFonts w:ascii="Mangal" w:hAnsi="Mangal"/>
-          <w:b/>
-          <w:sz w:val="74"/>
-          <w:szCs w:val="8"/>
-        </w:rPr>
-        <w:t xml:space="preserve">.</w:t>
-      </w:r>
-    </w:p>
-    <w:p>
-      <w:pPr>
-        <w:rPr>
-          <w:rFonts w:ascii="Mangal" w:hAnsi="Mangal"/>
-          <w:b/>
-          <w:bCs/>
-          <w:w w:val="110"/>
-          <w:sz w:val="44"/>
-          <w:szCs w:val="44"/>
-        </w:rPr>
-      </w:pPr>
-      <w:r>
-        <w:rPr>
-          <w:rFonts w:ascii="Mangal" w:hAnsi="Mangal"/>
-          <w:sz w:val="32"/>
-          <w:szCs w:val="32"/>
-        </w:rPr>
-        <w:t xml:space="preserve">को आ.व {{fiscalYear}} को साधारण सभा र लेखापरीक्षण प्रतिबेदन सहितदफा ५१ सहितयोनिवेदन पेश गरेको छु .</w:t>
-      </w:r>
-    </w:p>
-    <w:p>
-      <w:pPr>
-        <w:autoSpaceDE w:val="0"/>
-        <w:autoSpaceDN w:val="0"/>
-        <w:adjustRightInd w:val="0"/>
-        <w:jc w:val="both"/>
-        <w:rPr>
-          <w:rFonts w:ascii="Mangal" w:eastAsia="PMingLiU" w:hAnsi="Mangal" w:cs="Mangal"/>
-          <w:sz w:val="32"/>
-          <w:szCs w:val="32"/>
-          <w:lang w:eastAsia="zh-HK"/>
-        </w:rPr>
-      </w:pPr>
-    </w:p>
-    <w:p>
-      <w:pPr>
-        <w:autoSpaceDE w:val="0"/>
-        <w:autoSpaceDN w:val="0"/>
-        <w:adjustRightInd w:val="0"/>
-        <w:rPr>
-          <w:rFonts w:ascii="Mangal" w:hAnsi="Mangal"/>
-          <w:sz w:val="36"/>
-          <w:szCs w:val="36"/>
-          <w:u w:val="single"/>
-          <w:lang w:val="sv-SE"/>
-        </w:rPr>
-      </w:pPr>
-      <w:r>
-        <w:rPr>
-          <w:rFonts w:ascii="Mangal" w:hAnsi="Mangal"/>
-          <w:sz w:val="36"/>
-          <w:szCs w:val="36"/>
-          <w:u w:val="single"/>
-          <w:lang w:val="sv-SE"/>
-        </w:rPr>
-        <w:t xml:space="preserve">संलग्न कागजातहरूः</w:t>
-      </w:r>
-    </w:p>
-    <w:p>
-      <w:pPr>
-        <w:autoSpaceDE w:val="0"/>
-        <w:autoSpaceDN w:val="0"/>
-        <w:adjustRightInd w:val="0"/>
-        <w:rPr>
-          <w:rFonts w:ascii="Mangal" w:eastAsia="PMingLiU" w:hAnsi="Mangal" w:cs="Mangal"/>
-          <w:sz w:val="32"/>
-          <w:szCs w:val="32"/>
-          <w:lang w:eastAsia="zh-HK"/>
-        </w:rPr>
-      </w:pPr>
-    </w:p>
-    <w:p>
-      <w:pPr>
-        <w:pStyle w:val="BodyTextIndent"/>
-        <w:tabs>
-          <w:tab w:val="left" w:pos="896"/>
-        </w:tabs>
-        <w:ind w:left="896" w:hanging="336"/>
-        <w:jc w:val="both"/>
-        <w:rPr>
-          <w:rFonts w:ascii="Mangal" w:hAnsi="Mangal"/>
-          <w:sz w:val="36"/>
-          <w:szCs w:val="36"/>
-          <w:lang w:val="sv-SE"/>
-        </w:rPr>
-      </w:pPr>
-      <w:r>
-        <w:rPr>
-          <w:rFonts w:ascii="Mangal" w:hAnsi="Mangal"/>
-          <w:sz w:val="36"/>
-          <w:szCs w:val="36"/>
-          <w:lang w:val="sv-SE"/>
-        </w:rPr>
-        <w:t xml:space="preserve">१.कम्पनीको लेखा परीक्षणा प्रतिवेदन </w:t>
-      </w:r>
-    </w:p>
-    <w:p>
-      <w:pPr>
-        <w:pStyle w:val="BodyTextIndent"/>
-        <w:tabs>
-          <w:tab w:val="left" w:pos="896"/>
-        </w:tabs>
-        <w:ind w:left="896" w:hanging="336"/>
-        <w:rPr>
-          <w:rFonts w:ascii="Mangal" w:hAnsi="Mangal"/>
-          <w:sz w:val="36"/>
-          <w:szCs w:val="36"/>
-          <w:lang w:val="sv-SE"/>
-        </w:rPr>
-      </w:pPr>
-      <w:r>
-        <w:rPr>
-          <w:rFonts w:ascii="Mangal" w:hAnsi="Mangal"/>
-          <w:sz w:val="36"/>
-          <w:szCs w:val="36"/>
-          <w:lang w:val="sv-SE"/>
-        </w:rPr>
-        <w:t xml:space="preserve">२.कम्पनीको संचालक समितिको निर्णय</w:t>
-      </w:r>
-    </w:p>
-    <w:p>
-      <w:pPr>
-        <w:pStyle w:val="BodyTextIndent"/>
-        <w:tabs>
-          <w:tab w:val="left" w:pos="896"/>
-        </w:tabs>
-        <w:ind w:left="896" w:hanging="336"/>
-        <w:rPr>
-          <w:rFonts w:ascii="Mangal" w:hAnsi="Mangal"/>
-          <w:sz w:val="36"/>
-          <w:szCs w:val="36"/>
-          <w:lang w:val="sv-SE"/>
-        </w:rPr>
-      </w:pPr>
-      <w:r>
-        <w:rPr>
-          <w:rFonts w:ascii="Mangal" w:hAnsi="Mangal"/>
-          <w:sz w:val="36"/>
-          <w:szCs w:val="36"/>
-          <w:lang w:val="sv-SE"/>
-        </w:rPr>
-        <w:t xml:space="preserve">३.कम्पनीको वार्षिक साधारण सभाको निर्णय</w:t>
-      </w:r>
-    </w:p>
-    <w:p>
-      <w:pPr>
-        <w:pStyle w:val="BodyTextIndent"/>
-        <w:tabs>
-          <w:tab w:val="left" w:pos="896"/>
-        </w:tabs>
-        <w:ind w:left="896" w:hanging="336"/>
-        <w:rPr>
-          <w:rFonts w:ascii="Mangal" w:hAnsi="Mangal"/>
-          <w:sz w:val="36"/>
-          <w:szCs w:val="36"/>
-          <w:lang w:val="sv-SE"/>
-        </w:rPr>
-      </w:pPr>
-      <w:r>
-        <w:rPr>
-          <w:rFonts w:ascii="Mangal" w:hAnsi="Mangal"/>
-          <w:sz w:val="36"/>
-          <w:szCs w:val="36"/>
-          <w:lang w:val="sv-SE"/>
-        </w:rPr>
-        <w:t xml:space="preserve">४.कम्पनी ऐनको दफा ५१ नं. बमोजिमको विवरणा </w:t>
-      </w:r>
-    </w:p>
-    <w:p>
-      <w:pPr>
-        <w:pStyle w:val="BodyTextIndent"/>
-        <w:tabs>
-          <w:tab w:val="left" w:pos="896"/>
-        </w:tabs>
-        <w:rPr>
-          <w:rFonts w:ascii="Mangal" w:eastAsia="PMingLiU" w:hAnsi="Mangal" w:cs="Mangal"/>
-          <w:sz w:val="32"/>
-          <w:szCs w:val="32"/>
-          <w:lang w:eastAsia="zh-HK"/>
-        </w:rPr>
-      </w:pPr>
-    </w:p>
-    <w:p>
-      <w:pPr>
-        <w:ind w:left="360"/>
-        <w:rPr>
-          <w:rFonts w:ascii="Mangal" w:eastAsia="PMingLiU" w:hAnsi="Mangal" w:cs="Mangal"/>
-          <w:sz w:val="32"/>
-          <w:szCs w:val="32"/>
-          <w:lang w:eastAsia="zh-HK"/>
-        </w:rPr>
-      </w:pPr>
-    </w:p>
-    <w:p>
-      <w:pPr>
-        <w:ind w:left="360"/>
-        <w:rPr>
-          <w:rFonts w:ascii="Mangal" w:eastAsia="PMingLiU" w:hAnsi="Mangal" w:cs="Mangal"/>
-          <w:sz w:val="32"/>
-          <w:szCs w:val="32"/>
-          <w:lang w:eastAsia="zh-HK"/>
-        </w:rPr>
-      </w:pPr>
-    </w:p>
-    <w:p>
-      <w:pPr>
-        <w:jc w:val="right"/>
-        <w:rPr>
-          <w:rFonts w:ascii="Mangal" w:eastAsia="PMingLiU" w:hAnsi="Mangal" w:cs="Mangal"/>
-          <w:sz w:val="32"/>
-          <w:szCs w:val="32"/>
-          <w:lang w:eastAsia="zh-HK"/>
-        </w:rPr>
-      </w:pPr>
-      <w:r>
-        <w:rPr>
-          <w:rFonts w:ascii="Mangal" w:eastAsia="PMingLiU" w:hAnsi="Mangal"/>
-          <w:sz w:val="32"/>
-          <w:szCs w:val="32"/>
-          <w:lang w:eastAsia="zh-HK"/>
-        </w:rPr>
-        <w:t xml:space="preserve">.............................</w:t>
-      </w:r>
-    </w:p>
-    <w:p>
-      <w:pPr>
-        <w:tabs>
-          <w:tab w:val="left" w:pos="720"/>
-        </w:tabs>
-        <w:spacing w:line="360" w:lineRule="auto"/>
-        <w:jc w:val="right"/>
-        <w:rPr>
-          <w:rFonts w:ascii="Mangal" w:hAnsi="Mangal"/>
-          <w:b/>
-          <w:sz w:val="32"/>
-          <w:szCs w:val="32"/>
-        </w:rPr>
-      </w:pPr>
-      <w:r>
-        <w:rPr>
-          <w:rFonts w:ascii="Mangal" w:hAnsi="Mangal"/>
-          <w:b/>
-          <w:sz w:val="36"/>
-          <w:szCs w:val="36"/>
-        </w:rPr>
-        <w:t xml:space="preserve">                                                                  {{chairmanName}}</w:t>
-      </w:r>
-      <w:r>
-        <w:rPr>
-          <w:rFonts w:ascii="Mangal" w:hAnsi="Mangal"/>
-          <w:b/>
-          <w:sz w:val="32"/>
-          <w:szCs w:val="32"/>
-        </w:rPr>
-        <w:t xml:space="preserve">अध्यक्ष</w:t>
-      </w:r>
-    </w:p>
-    <w:p>
-      <w:pPr>
-        <w:spacing w:line="360" w:lineRule="atLeast"/>
-        <w:jc w:val="center"/>
-        <w:rPr>
-          <w:rFonts w:ascii="Mangal" w:hAnsi="Mangal"/>
-          <w:b/>
-          <w:sz w:val="34"/>
-          <w:szCs w:val="34"/>
-        </w:rPr>
-      </w:pPr>
-    </w:p>
-    <w:p>
-      <w:pPr>
-        <w:spacing w:line="360" w:lineRule="atLeast"/>
-        <w:jc w:val="center"/>
-        <w:rPr>
-          <w:rFonts w:ascii="Mangal" w:hAnsi="Mangal"/>
-          <w:b/>
-          <w:sz w:val="34"/>
-          <w:szCs w:val="34"/>
-        </w:rPr>
       </w:pPr>
     </w:p>
     <w:p>
@@ -3530,19 +3795,100 @@
         <w:rPr>
           <w:rFonts w:ascii="Mangal" w:hAnsi="Mangal"/>
           <w:b/>
-          <w:sz w:val="74"/>
-          <w:szCs w:val="8"/>
-        </w:rPr>
-      </w:pPr>
-      <w:r>
-        <w:rPr>
-          <w:rFonts w:ascii="Mangal" w:hAnsi="Mangal"/>
-          <w:b/>
           <w:bCs/>
           <w:sz w:val="74"/>
           <w:szCs w:val="8"/>
         </w:rPr>
-        <w:t xml:space="preserve">{{companyName}} प्रा.लि.</w:t>
+      </w:pPr>
+    </w:p>
+    <w:p>
+      <w:pPr>
+        <w:jc w:val="center"/>
+        <w:rPr>
+          <w:rFonts w:ascii="Mangal" w:hAnsi="Mangal"/>
+          <w:b/>
+          <w:bCs/>
+          <w:sz w:val="74"/>
+          <w:szCs w:val="8"/>
+        </w:rPr>
+      </w:pPr>
+    </w:p>
+    <w:p>
+      <w:pPr>
+        <w:jc w:val="center"/>
+        <w:rPr>
+          <w:rFonts w:ascii="Mangal" w:hAnsi="Mangal"/>
+          <w:b/>
+          <w:bCs/>
+          <w:sz w:val="74"/>
+          <w:szCs w:val="8"/>
+        </w:rPr>
+      </w:pPr>
+    </w:p>
+    <w:p>
+      <w:pPr>
+        <w:jc w:val="center"/>
+        <w:rPr>
+          <w:rFonts w:ascii="Mangal" w:hAnsi="Mangal"/>
+          <w:b/>
+          <w:sz w:val="74"/>
+          <w:szCs w:val="8"/>
+        </w:rPr>
+      </w:pPr>
+      <w:r>
+        <w:rPr>
+          <w:rFonts w:ascii="Mangal" w:hAnsi="Mangal"/>
+          <w:b/>
+          <w:bCs/>
+          <w:sz w:val="74"/>
+          <w:szCs w:val="8"/>
+        </w:rPr>
+        <w:lastRenderedPageBreak/>
+        <w:t>{{</w:t>
+      </w:r>
+      <w:proofErr w:type="spellStart"/>
+      <w:r>
+        <w:rPr>
+          <w:rFonts w:ascii="Mangal" w:hAnsi="Mangal"/>
+          <w:b/>
+          <w:bCs/>
+          <w:sz w:val="74"/>
+          <w:szCs w:val="8"/>
+        </w:rPr>
+        <w:t>companyName</w:t>
+      </w:r>
+      <w:proofErr w:type="spellEnd"/>
+      <w:r>
+        <w:rPr>
+          <w:rFonts w:ascii="Mangal" w:hAnsi="Mangal"/>
+          <w:b/>
+          <w:bCs/>
+          <w:sz w:val="74"/>
+          <w:szCs w:val="8"/>
+        </w:rPr>
+        <w:t xml:space="preserve">}} </w:t>
+      </w:r>
+      <w:proofErr w:type="spellStart"/>
+      <w:r>
+        <w:rPr>
+          <w:rFonts w:ascii="Mangal" w:hAnsi="Mangal"/>
+          <w:b/>
+          <w:bCs/>
+          <w:sz w:val="74"/>
+          <w:szCs w:val="8"/>
+        </w:rPr>
+        <w:t>प्रा.लि</w:t>
+      </w:r>
+      <w:proofErr w:type="spellEnd"/>
+      <w:r>
+        <w:rPr>
+          <w:rFonts w:ascii="Mangal" w:hAnsi="Mangal"/>
+          <w:b/>
+          <w:bCs/>
+          <w:sz w:val="74"/>
+          <w:szCs w:val="8"/>
+        </w:rPr>
+        <w:t>.</w:t>
       </w:r>
     </w:p>
     <w:p>
@@ -3592,41 +3938,41 @@
           <w:sz w:val="32"/>
           <w:szCs w:val="32"/>
         </w:rPr>
-        <w:t xml:space="preserve">मितिः– {{letterDate}}</w:t>
-      </w:r>
-    </w:p>
-    <w:p>
-      <w:pPr>
-        <w:rPr>
-          <w:rFonts w:ascii="Mangal" w:hAnsi="Mangal"/>
-          <w:sz w:val="32"/>
-          <w:szCs w:val="32"/>
-        </w:rPr>
-      </w:pPr>
-      <w:r>
-        <w:rPr>
-          <w:rFonts w:ascii="Mangal" w:hAnsi="Mangal"/>
-          <w:sz w:val="32"/>
-          <w:szCs w:val="32"/>
-        </w:rPr>
-        <w:t xml:space="preserve">श्रीमान् रजिष्ट्ार ज्यू,</w:t>
-      </w:r>
-    </w:p>
-    <w:p>
-      <w:pPr>
-        <w:rPr>
-          <w:rFonts w:ascii="Mangal" w:hAnsi="Mangal"/>
-          <w:sz w:val="32"/>
-          <w:szCs w:val="32"/>
-        </w:rPr>
-      </w:pPr>
-      <w:r>
-        <w:rPr>
-          <w:rFonts w:ascii="Mangal" w:hAnsi="Mangal"/>
-          <w:sz w:val="32"/>
-          <w:szCs w:val="32"/>
-        </w:rPr>
-        <w:t xml:space="preserve">कम्पनी रजिष्ट्ार कार्यालय</w:t>
+        <w:t>मितिः– {{letterDate}}</w:t>
+      </w:r>
+    </w:p>
+    <w:p>
+      <w:pPr>
+        <w:rPr>
+          <w:rFonts w:ascii="Mangal" w:hAnsi="Mangal"/>
+          <w:sz w:val="32"/>
+          <w:szCs w:val="32"/>
+        </w:rPr>
+      </w:pPr>
+      <w:r>
+        <w:rPr>
+          <w:rFonts w:ascii="Mangal" w:hAnsi="Mangal"/>
+          <w:sz w:val="32"/>
+          <w:szCs w:val="32"/>
+        </w:rPr>
+        <w:t>श्रीमान् रजिष्ट्ार ज्यू,</w:t>
+      </w:r>
+    </w:p>
+    <w:p>
+      <w:pPr>
+        <w:rPr>
+          <w:rFonts w:ascii="Mangal" w:hAnsi="Mangal"/>
+          <w:sz w:val="32"/>
+          <w:szCs w:val="32"/>
+        </w:rPr>
+      </w:pPr>
+      <w:r>
+        <w:rPr>
+          <w:rFonts w:ascii="Mangal" w:hAnsi="Mangal"/>
+          <w:sz w:val="32"/>
+          <w:szCs w:val="32"/>
+        </w:rPr>
+        <w:t>कम्पनी रजिष्ट्ार कार्यालय</w:t>
       </w:r>
     </w:p>
     <w:p>
@@ -3679,7 +4025,7 @@
           <w:sz w:val="32"/>
           <w:szCs w:val="32"/>
         </w:rPr>
-        <w:t xml:space="preserve">महोदय ,</w:t>
+        <w:t>महोदय ,</w:t>
       </w:r>
     </w:p>
     <w:p>
@@ -3699,36 +4045,6 @@
         </w:rPr>
         <w:t xml:space="preserve">उपरोक्त सम्बन्धमा यस प्रा. लि को आ. ब. {{fiscalYear}} को लेखापरीक्षण कार्यका निमित्त {{auditFirmName}} का {{auditorTitle}} {{auditorName}} लाई  नियुक्त गरीएको र पारीश्रमीक रू {{auditFee}} कायम हुने गरी पारीश्रमीक निर्धारणा गरीएको यस पत्रका साथ निबेदन गर्न चाहान्छु . </w:t>
       </w:r>
-    </w:p>
-    <w:p>
-      <w:pPr>
-        <w:ind w:firstLine="720"/>
-        <w:rPr>
-          <w:rFonts w:ascii="Mangal" w:hAnsi="Mangal"/>
-          <w:sz w:val="32"/>
-          <w:szCs w:val="32"/>
-        </w:rPr>
-      </w:pPr>
-    </w:p>
-    <w:p>
-      <w:pPr>
-        <w:ind w:firstLine="720"/>
-        <w:rPr>
-          <w:rFonts w:ascii="Mangal" w:hAnsi="Mangal"/>
-          <w:sz w:val="32"/>
-          <w:szCs w:val="32"/>
-        </w:rPr>
-      </w:pPr>
-    </w:p>
-    <w:p>
-      <w:pPr>
-        <w:ind w:firstLine="720"/>
-        <w:rPr>
-          <w:rFonts w:ascii="Mangal" w:hAnsi="Mangal"/>
-          <w:sz w:val="32"/>
-          <w:szCs w:val="32"/>
-        </w:rPr>
-      </w:pPr>
     </w:p>
     <w:p>
       <w:pPr>
@@ -3748,8 +4064,25 @@
           <w:sz w:val="32"/>
           <w:szCs w:val="32"/>
         </w:rPr>
-        <w:t xml:space="preserve">                                                                  </w:t>
-      </w:r>
+        <w:t xml:space="preserve">                                                        </w:t>
+      </w:r>
+      <w:r>
+        <w:rPr>
+          <w:rFonts w:ascii="Mangal" w:hAnsi="Mangal"/>
+          <w:sz w:val="32"/>
+          <w:szCs w:val="32"/>
+        </w:rPr>
+        <w:t xml:space="preserve">      </w:t>
+      </w:r>
+      <w:r>
+        <w:rPr>
+          <w:rFonts w:ascii="Mangal" w:hAnsi="Mangal"/>
+          <w:sz w:val="32"/>
+          <w:szCs w:val="32"/>
+        </w:rPr>
+        <w:t xml:space="preserve">                      </w:t>
+      </w:r>
+      <w:proofErr w:type="spellStart"/>
       <w:r>
         <w:rPr>
           <w:rFonts w:ascii="Mangal" w:hAnsi="Mangal"/>
@@ -3757,7 +4090,57 @@
           <w:szCs w:val="32"/>
           <w:u w:val="single"/>
         </w:rPr>
-        <w:t xml:space="preserve">निवेदक</w:t>
+        <w:t>निवेदक</w:t>
+      </w:r>
+      <w:proofErr w:type="spellEnd"/>
+    </w:p>
+    <w:p>
+      <w:pPr>
+        <w:tabs>
+          <w:tab w:val="left" w:pos="1035"/>
+        </w:tabs>
+        <w:rPr>
+          <w:rFonts w:ascii="Mangal" w:hAnsi="Mangal"/>
+          <w:sz w:val="32"/>
+          <w:szCs w:val="32"/>
+          <w:u w:val="single"/>
+        </w:rPr>
+      </w:pPr>
+      <w:proofErr w:type="spellStart"/>
+      <w:r>
+        <w:rPr>
+          <w:rFonts w:ascii="Mangal" w:hAnsi="Mangal"/>
+          <w:sz w:val="32"/>
+          <w:szCs w:val="32"/>
+        </w:rPr>
+        <w:t>श्री</w:t>
+      </w:r>
+      <w:proofErr w:type="spellEnd"/>
+      <w:r>
+        <w:rPr>
+          <w:rFonts w:ascii="Mangal" w:hAnsi="Mangal"/>
+          <w:sz w:val="32"/>
+          <w:szCs w:val="32"/>
+        </w:rPr>
+        <w:t xml:space="preserve"> {{</w:t>
+      </w:r>
+      <w:proofErr w:type="spellStart"/>
+      <w:r>
+        <w:rPr>
+          <w:rFonts w:ascii="Mangal" w:hAnsi="Mangal"/>
+          <w:sz w:val="32"/>
+          <w:szCs w:val="32"/>
+        </w:rPr>
+        <w:t>chairmanName</w:t>
+      </w:r>
+      <w:proofErr w:type="spellEnd"/>
+      <w:r>
+        <w:rPr>
+          <w:rFonts w:ascii="Mangal" w:hAnsi="Mangal"/>
+          <w:sz w:val="32"/>
+          <w:szCs w:val="32"/>
+        </w:rPr>
+        <w:t>}}</w:t>
       </w:r>
     </w:p>
     <w:p>
@@ -3769,51 +4152,13 @@
           <w:szCs w:val="32"/>
         </w:rPr>
       </w:pPr>
-    </w:p>
-    <w:p>
-      <w:pPr>
-        <w:ind w:firstLine="720"/>
-        <w:rPr>
-          <w:rFonts w:ascii="Mangal" w:hAnsi="Mangal"/>
-          <w:sz w:val="32"/>
-          <w:szCs w:val="32"/>
-        </w:rPr>
-      </w:pPr>
-    </w:p>
-    <w:p>
-      <w:pPr>
-        <w:ind w:firstLine="720"/>
-        <w:rPr>
-          <w:rFonts w:ascii="Mangal" w:hAnsi="Mangal"/>
-          <w:sz w:val="32"/>
-          <w:szCs w:val="32"/>
-        </w:rPr>
-      </w:pPr>
-      <w:r>
-        <w:rPr>
-          <w:rFonts w:ascii="Mangal" w:hAnsi="Mangal"/>
-          <w:sz w:val="32"/>
-          <w:szCs w:val="32"/>
-        </w:rPr>
-        <w:t xml:space="preserve">      श्री {{chairmanName}}</w:t>
-      </w:r>
-    </w:p>
-    <w:p>
-      <w:pPr>
-        <w:ind w:firstLine="720"/>
-        <w:rPr>
-          <w:rFonts w:ascii="Mangal" w:hAnsi="Mangal"/>
-          <w:sz w:val="32"/>
-          <w:szCs w:val="32"/>
-        </w:rPr>
-      </w:pPr>
-      <w:r>
-        <w:rPr>
-          <w:rFonts w:ascii="Mangal" w:hAnsi="Mangal"/>
-          <w:sz w:val="32"/>
-          <w:szCs w:val="32"/>
-        </w:rPr>
-        <w:t xml:space="preserve">       अध्यक्ष </w:t>
+      <w:r>
+        <w:rPr>
+          <w:rFonts w:ascii="Mangal" w:hAnsi="Mangal"/>
+          <w:sz w:val="32"/>
+          <w:szCs w:val="32"/>
+        </w:rPr>
+        <w:t xml:space="preserve"> अध्यक्ष </w:t>
       </w:r>
     </w:p>
     <w:p>
@@ -3856,86 +4201,65 @@
           <w:tab w:val="left" w:pos="6480"/>
           <w:tab w:val="left" w:pos="8110"/>
         </w:tabs>
-        <w:ind w:firstLine="720"/>
-        <w:rPr>
-          <w:rFonts w:ascii="Mangal" w:hAnsi="Mangal"/>
-          <w:sz w:val="32"/>
-          <w:szCs w:val="32"/>
-        </w:rPr>
-      </w:pPr>
-      <w:r>
-        <w:rPr>
-          <w:rFonts w:ascii="Mangal" w:hAnsi="Mangal"/>
-          <w:sz w:val="32"/>
-          <w:szCs w:val="32"/>
-        </w:rPr>
-        <w:tab/>
-      </w:r>
-      <w:r>
-        <w:rPr>
-          <w:rFonts w:ascii="Mangal" w:hAnsi="Mangal"/>
-          <w:sz w:val="32"/>
-          <w:szCs w:val="32"/>
-        </w:rPr>
-        <w:tab/>
-      </w:r>
-      <w:r>
-        <w:rPr>
-          <w:rFonts w:ascii="Mangal" w:hAnsi="Mangal"/>
-          <w:sz w:val="32"/>
-          <w:szCs w:val="32"/>
-        </w:rPr>
-        <w:tab/>
-      </w:r>
-    </w:p>
-    <w:p>
-      <w:pPr>
-        <w:tabs>
-          <w:tab w:val="left" w:pos="720"/>
-          <w:tab w:val="left" w:pos="1440"/>
-          <w:tab w:val="left" w:pos="2160"/>
-          <w:tab w:val="left" w:pos="2880"/>
-          <w:tab w:val="left" w:pos="3600"/>
-          <w:tab w:val="left" w:pos="4320"/>
-          <w:tab w:val="left" w:pos="5040"/>
-          <w:tab w:val="left" w:pos="5760"/>
-          <w:tab w:val="left" w:pos="6480"/>
-          <w:tab w:val="left" w:pos="8110"/>
-        </w:tabs>
-        <w:rPr>
-          <w:rFonts w:ascii="Mangal" w:hAnsi="Mangal"/>
-          <w:sz w:val="32"/>
-          <w:szCs w:val="32"/>
-        </w:rPr>
-      </w:pPr>
-    </w:p>
-    <w:p>
-      <w:pPr>
-        <w:tabs>
-          <w:tab w:val="left" w:pos="720"/>
-          <w:tab w:val="left" w:pos="1440"/>
-          <w:tab w:val="left" w:pos="2160"/>
-          <w:tab w:val="left" w:pos="2880"/>
-          <w:tab w:val="left" w:pos="3600"/>
-          <w:tab w:val="left" w:pos="4320"/>
-          <w:tab w:val="left" w:pos="5040"/>
-          <w:tab w:val="left" w:pos="5760"/>
-          <w:tab w:val="left" w:pos="6480"/>
-          <w:tab w:val="left" w:pos="8110"/>
-        </w:tabs>
-        <w:rPr>
-          <w:rFonts w:ascii="Mangal" w:hAnsi="Mangal"/>
-          <w:sz w:val="32"/>
-          <w:szCs w:val="32"/>
-        </w:rPr>
-      </w:pPr>
-      <w:r>
-        <w:rPr>
-          <w:rFonts w:ascii="Mangal" w:hAnsi="Mangal"/>
-          <w:sz w:val="32"/>
-          <w:szCs w:val="32"/>
-        </w:rPr>
-        <w:t xml:space="preserve">बोधार्थ ः श्री {{auditFirmName}}</w:t>
+        <w:rPr>
+          <w:rFonts w:ascii="Mangal" w:hAnsi="Mangal"/>
+          <w:sz w:val="32"/>
+          <w:szCs w:val="32"/>
+        </w:rPr>
+      </w:pPr>
+      <w:proofErr w:type="spellStart"/>
+      <w:r>
+        <w:rPr>
+          <w:rFonts w:ascii="Mangal" w:hAnsi="Mangal"/>
+          <w:sz w:val="32"/>
+          <w:szCs w:val="32"/>
+        </w:rPr>
+        <w:t>बोधार्थ</w:t>
+      </w:r>
+      <w:proofErr w:type="spellEnd"/>
+      <w:r>
+        <w:rPr>
+          <w:rFonts w:ascii="Mangal" w:hAnsi="Mangal"/>
+          <w:sz w:val="32"/>
+          <w:szCs w:val="32"/>
+        </w:rPr>
+        <w:t xml:space="preserve"> ः </w:t>
+      </w:r>
+      <w:proofErr w:type="spellStart"/>
+      <w:r>
+        <w:rPr>
+          <w:rFonts w:ascii="Mangal" w:hAnsi="Mangal"/>
+          <w:sz w:val="32"/>
+          <w:szCs w:val="32"/>
+        </w:rPr>
+        <w:t>श्री</w:t>
+      </w:r>
+      <w:proofErr w:type="spellEnd"/>
+      <w:r>
+        <w:rPr>
+          <w:rFonts w:ascii="Mangal" w:hAnsi="Mangal"/>
+          <w:sz w:val="32"/>
+          <w:szCs w:val="32"/>
+        </w:rPr>
+        <w:t xml:space="preserve"> {{</w:t>
+      </w:r>
+      <w:proofErr w:type="spellStart"/>
+      <w:r>
+        <w:rPr>
+          <w:rFonts w:ascii="Mangal" w:hAnsi="Mangal"/>
+          <w:sz w:val="32"/>
+          <w:szCs w:val="32"/>
+        </w:rPr>
+        <w:t>auditFirmName</w:t>
+      </w:r>
+      <w:proofErr w:type="spellEnd"/>
+      <w:r>
+        <w:rPr>
+          <w:rFonts w:ascii="Mangal" w:hAnsi="Mangal"/>
+          <w:sz w:val="32"/>
+          <w:szCs w:val="32"/>
+        </w:rPr>
+        <w:t>}}</w:t>
       </w:r>
     </w:p>
     <w:p>
@@ -5049,4 +5373,16 @@
   <a:objectDefaults/>
   <a:extraClrSchemeLst/>
 </a:theme>
+</file>
+
+<file path=customXml/item1.xml><?xml version="1.0" encoding="utf-8"?>
+<b:Sources xmlns:b="http://schemas.openxmlformats.org/officeDocument/2006/bibliography" xmlns="http://schemas.openxmlformats.org/officeDocument/2006/bibliography" SelectedStyle="\APASixthEditionOfficeOnline.xsl" StyleName="APA" Version="6"/>
+</file>
+
+<file path=customXml/itemProps1.xml><?xml version="1.0" encoding="utf-8"?>
+<ds:datastoreItem xmlns:ds="http://schemas.openxmlformats.org/officeDocument/2006/customXml" ds:itemID="{E6C3A7A0-D640-41DE-A4C4-81E5F83E7B6E}">
+  <ds:schemaRefs>
+    <ds:schemaRef ds:uri="http://schemas.openxmlformats.org/officeDocument/2006/bibliography"/>
+  </ds:schemaRefs>
+</ds:datastoreItem>
 </file>
</xml_diff>

<commit_message>
fix(bmAgm): left-align निवेदक above the chairman's name in the registrar letter
It was pushed to the right margin via ~70 leading space characters, sitting
isolated from the closing paragraph. Left-aligned to match normal letter
convention — sits directly above the signatory's name with no extra gap.
</commit_message>
<xml_diff>
--- a/assets/templates/bm-agm-minutes.docx
+++ b/assets/templates/bm-agm-minutes.docx
@@ -4060,9 +4060,7 @@
     </w:p>
     <w:p>
       <w:pPr>
-        <w:tabs>
-          <w:tab w:val="left" w:pos="1035"/>
-        </w:tabs>
+        <w:jc w:val="left"/>
         <w:rPr>
           <w:rFonts w:ascii="Mangal" w:hAnsi="Mangal"/>
           <w:sz w:val="32"/>
@@ -4070,30 +4068,6 @@
           <w:u w:val="single"/>
         </w:rPr>
       </w:pPr>
-      <w:r>
-        <w:rPr>
-          <w:rFonts w:ascii="Mangal" w:hAnsi="Mangal"/>
-          <w:sz w:val="32"/>
-          <w:szCs w:val="32"/>
-        </w:rPr>
-        <w:t xml:space="preserve">                                                        </w:t>
-      </w:r>
-      <w:r>
-        <w:rPr>
-          <w:rFonts w:ascii="Mangal" w:hAnsi="Mangal"/>
-          <w:sz w:val="32"/>
-          <w:szCs w:val="32"/>
-        </w:rPr>
-        <w:t xml:space="preserve">      </w:t>
-      </w:r>
-      <w:r>
-        <w:rPr>
-          <w:rFonts w:ascii="Mangal" w:hAnsi="Mangal"/>
-          <w:sz w:val="32"/>
-          <w:szCs w:val="32"/>
-        </w:rPr>
-        <w:t xml:space="preserve">                      </w:t>
-      </w:r>
       <w:proofErr w:type="spellStart"/>
       <w:r>
         <w:rPr>

</xml_diff>

<commit_message>
revert(bmAgm): undo निवेदक left-alignment on the registrar letter
Reverts 6eead48 — the fix wasn't what was wanted. Holding until we
confirm exactly what the last page (registrar letter) should look like.
</commit_message>
<xml_diff>
--- a/assets/templates/bm-agm-minutes.docx
+++ b/assets/templates/bm-agm-minutes.docx
@@ -4060,7 +4060,9 @@
     </w:p>
     <w:p>
       <w:pPr>
-        <w:jc w:val="left"/>
+        <w:tabs>
+          <w:tab w:val="left" w:pos="1035"/>
+        </w:tabs>
         <w:rPr>
           <w:rFonts w:ascii="Mangal" w:hAnsi="Mangal"/>
           <w:sz w:val="32"/>
@@ -4068,6 +4070,30 @@
           <w:u w:val="single"/>
         </w:rPr>
       </w:pPr>
+      <w:r>
+        <w:rPr>
+          <w:rFonts w:ascii="Mangal" w:hAnsi="Mangal"/>
+          <w:sz w:val="32"/>
+          <w:szCs w:val="32"/>
+        </w:rPr>
+        <w:t xml:space="preserve">                                                        </w:t>
+      </w:r>
+      <w:r>
+        <w:rPr>
+          <w:rFonts w:ascii="Mangal" w:hAnsi="Mangal"/>
+          <w:sz w:val="32"/>
+          <w:szCs w:val="32"/>
+        </w:rPr>
+        <w:t xml:space="preserve">      </w:t>
+      </w:r>
+      <w:r>
+        <w:rPr>
+          <w:rFonts w:ascii="Mangal" w:hAnsi="Mangal"/>
+          <w:sz w:val="32"/>
+          <w:szCs w:val="32"/>
+        </w:rPr>
+        <w:t xml:space="preserve">                      </w:t>
+      </w:r>
       <w:proofErr w:type="spellStart"/>
       <w:r>
         <w:rPr>

</xml_diff>

<commit_message>
revert(bmAgm): restore निवेदक left-alignment — it was correct after all
</commit_message>
<xml_diff>
--- a/assets/templates/bm-agm-minutes.docx
+++ b/assets/templates/bm-agm-minutes.docx
@@ -4060,9 +4060,7 @@
     </w:p>
     <w:p>
       <w:pPr>
-        <w:tabs>
-          <w:tab w:val="left" w:pos="1035"/>
-        </w:tabs>
+        <w:jc w:val="left"/>
         <w:rPr>
           <w:rFonts w:ascii="Mangal" w:hAnsi="Mangal"/>
           <w:sz w:val="32"/>
@@ -4070,30 +4068,6 @@
           <w:u w:val="single"/>
         </w:rPr>
       </w:pPr>
-      <w:r>
-        <w:rPr>
-          <w:rFonts w:ascii="Mangal" w:hAnsi="Mangal"/>
-          <w:sz w:val="32"/>
-          <w:szCs w:val="32"/>
-        </w:rPr>
-        <w:t xml:space="preserve">                                                        </w:t>
-      </w:r>
-      <w:r>
-        <w:rPr>
-          <w:rFonts w:ascii="Mangal" w:hAnsi="Mangal"/>
-          <w:sz w:val="32"/>
-          <w:szCs w:val="32"/>
-        </w:rPr>
-        <w:t xml:space="preserve">      </w:t>
-      </w:r>
-      <w:r>
-        <w:rPr>
-          <w:rFonts w:ascii="Mangal" w:hAnsi="Mangal"/>
-          <w:sz w:val="32"/>
-          <w:szCs w:val="32"/>
-        </w:rPr>
-        <w:t xml:space="preserve">                      </w:t>
-      </w:r>
       <w:proofErr w:type="spellStart"/>
       <w:r>
         <w:rPr>

</xml_diff>

<commit_message>
fix(bmAgmMinutes): correct Nepali spelling, terminology, and punctuation in template
Fixed spelling errors (सञ्चालक, छलफल, विसर्जन, बारे, पारिश्रमिक, etc.),
standardized आ.व. abbreviation and terminology to match the auditor-change
templates, replaced numbering underscores (क_, १_) with parentheses, tightened
inconsistent spacing, and adopted the Devanagari danda (।) for sentence-final
punctuation to match the sibling auditor-change templates. Text only — no
layout, formatting, tokens, or factual data touched; verified via XML
well-formedness check and a real render through the app's own docx pipeline.
</commit_message>
<xml_diff>
--- a/assets/templates/bm-agm-minutes.docx
+++ b/assets/templates/bm-agm-minutes.docx
@@ -38,7 +38,7 @@
           <w:sz w:val="36"/>
           <w:szCs w:val="36"/>
         </w:rPr>
-        <w:t xml:space="preserve">प्रा.लि दर्ता न {{registrationNumber}}</w:t>
+        <w:t xml:space="preserve">प्रा.लि. दर्ता नं. {{registrationNumber}}</w:t>
       </w:r>
     </w:p>
     <w:p>
@@ -73,7 +73,7 @@
           <w:sz w:val="36"/>
           <w:szCs w:val="36"/>
         </w:rPr>
-        <w:t>संचालक समितिको बैठक</w:t>
+        <w:t>सञ्चालक समितिको बैठक</w:t>
       </w:r>
     </w:p>
     <w:p>
@@ -109,7 +109,7 @@
           <w:szCs w:val="32"/>
           <w:lang w:eastAsia="zh-HK"/>
         </w:rPr>
-        <w:t xml:space="preserve">आजमिति {{bmYear}} साल {{bmMonthName}} महिनाको {{bmDay}} गतेका दिन कम्पनीको कार्यालय </w:t>
+        <w:t xml:space="preserve">आज मिति {{bmYear}} साल {{bmMonthName}} महिनाको {{bmDay}} गतेका दिन कम्पनीको कार्यालय </w:t>
       </w:r>
       <w:r>
         <w:rPr>
@@ -158,7 +158,7 @@
           <w:szCs w:val="32"/>
           <w:lang w:eastAsia="zh-HK"/>
         </w:rPr>
-        <w:t>को अध्यक्षतामा कम्पनीको संचालक समितिको बैठक बसी निम्नानुसारको प्रस्ताव उपर छलफल गरि निम्नानुसारको निर्णय गरियो .</w:t>
+        <w:t>को अध्यक्षतामा कम्पनीको सञ्चालक समितिको बैठक बसी निम्नानुसारको प्रस्ताव उपर छलफल गरी निम्नानुसारको निर्णय गरियो ।</w:t>
       </w:r>
     </w:p>
     <w:p>
@@ -183,7 +183,7 @@
           <w:szCs w:val="32"/>
           <w:lang w:eastAsia="zh-HK"/>
         </w:rPr>
-        <w:t xml:space="preserve">उपस्थिति ः </w:t>
+        <w:t xml:space="preserve">उपस्थितिः </w:t>
       </w:r>
       <w:r>
         <w:rPr>
@@ -295,7 +295,7 @@
           <w:szCs w:val="32"/>
           <w:lang w:val="pt-BR"/>
         </w:rPr>
-        <w:t xml:space="preserve"> ः–</w:t>
+        <w:t xml:space="preserve">ः–</w:t>
       </w:r>
     </w:p>
     <w:p>
@@ -319,7 +319,7 @@
           <w:szCs w:val="32"/>
           <w:lang w:val="pl-PL"/>
         </w:rPr>
-        <w:t>१.कम्पनीको वार्षिक साधारण सभाको मिति, स्थान र छलफलका विषय निश्चित गर्ने सम्बन्धमा,</w:t>
+        <w:t>१. कम्पनीको वार्षिक साधारण सभाको मिति, स्थान र छलफलका विषय निश्चित गर्ने सम्बन्धमा ।</w:t>
       </w:r>
     </w:p>
     <w:p>
@@ -344,7 +344,7 @@
           <w:lang w:val="pl-PL"/>
         </w:rPr>
         <w:lastRenderedPageBreak/>
-        <w:t>२.विविध .</w:t>
+        <w:t>२. विविध ।</w:t>
       </w:r>
     </w:p>
     <w:p>
@@ -404,7 +404,7 @@
           <w:szCs w:val="32"/>
           <w:lang w:val="pl-PL"/>
         </w:rPr>
-        <w:t>१.कम्पनीको वार्षिक साधारण सभा बस्ने सम्बन्धमा ः–</w:t>
+        <w:t>१. कम्पनीको वार्षिक साधारण सभा बस्ने सम्बन्धमाः–</w:t>
       </w:r>
     </w:p>
     <w:p>
@@ -430,7 +430,7 @@
           <w:szCs w:val="32"/>
           <w:lang w:val="pl-PL"/>
         </w:rPr>
-        <w:t>क_यस कम्पनीको प्रबन्ध पत्र, तथा नियमावली बमोजिम बोलाउनु पर्ने कम्पनीको वार्षिक साधारण सभा बोलाउन आवश्यक भएकोले आगामी {{agmDateFull}} गते दिनको {{agmTime}} बजे कम्पनीको कार्यालयमा कम्पनीको वार्षिक साधारण सभा बोलाउने निर्णय गरिएको छ .</w:t>
+        <w:t>क) यस कम्पनीको प्रबन्ध पत्र तथा नियमावली बमोजिम बोलाउनु पर्ने कम्पनीको वार्षिक साधारण सभा बोलाउन आवश्यक भएकोले आगामी {{agmDateFull}} गते दिनको {{agmTime}} बजे कम्पनीको कार्यालयमा कम्पनीको वार्षिक साधारण सभा बोलाउने निर्णय गरिएको छ ।</w:t>
       </w:r>
     </w:p>
     <w:p>
@@ -456,7 +456,7 @@
           <w:szCs w:val="32"/>
           <w:lang w:val="pl-PL"/>
         </w:rPr>
-        <w:t>ख_माथि खणड -क_ बमोजिम बस्ने वार्षिक साधारण सभामा छलफलको निमित्त देहायका विषयहरू समावेश गर्ने निर्णय गरिएको छ ः–</w:t>
+        <w:t>ख) माथि खण्ड (क) बमोजिम बस्ने वार्षिक साधारण सभामा छलफलको निमित्त देहायका विषयहरू समावेश गर्ने निर्णय गरिएको छः–</w:t>
       </w:r>
     </w:p>
     <w:p>
@@ -481,7 +481,7 @@
           <w:szCs w:val="32"/>
           <w:lang w:val="pl-PL"/>
         </w:rPr>
-        <w:t>१_अध्यक्षज्यूको प्रतिवेदन सम्बन्धमा .</w:t>
+        <w:t>१) अध्यक्षज्यूको प्रतिवेदन सम्बन्धमा ।</w:t>
       </w:r>
     </w:p>
     <w:p>
@@ -506,7 +506,7 @@
           <w:szCs w:val="32"/>
           <w:lang w:val="pl-PL"/>
         </w:rPr>
-        <w:t>२_आ.व.{{fiscalYear}} को लेखापरीक्षण प्रतिवेदन सम्बन्धमा .</w:t>
+        <w:t>२) आ.व. {{fiscalYear}} को लेखापरीक्षण प्रतिवेदन सम्बन्धमा ।</w:t>
       </w:r>
     </w:p>
     <w:p>
@@ -531,7 +531,7 @@
           <w:szCs w:val="32"/>
           <w:lang w:val="pl-PL"/>
         </w:rPr>
-        <w:t>३_आ.व. {{nextFiscalYear}} को निमित्त लेखापरीक्षक नियुक्ति र पारिश्रमिक तय गर्ने सम्बन्धमा .</w:t>
+        <w:t>३) आ.व. {{nextFiscalYear}} को निमित्त लेखापरीक्षक नियुक्ति र पारिश्रमिक तय गर्ने सम्बन्धमा ।</w:t>
       </w:r>
     </w:p>
     <w:p>
@@ -556,7 +556,7 @@
           <w:szCs w:val="32"/>
           <w:lang w:val="pl-PL"/>
         </w:rPr>
-        <w:t>४_विविध .</w:t>
+        <w:t>४) विविध ।</w:t>
       </w:r>
     </w:p>
     <w:p>
@@ -597,7 +597,7 @@
           <w:szCs w:val="32"/>
           <w:lang w:val="pl-PL"/>
         </w:rPr>
-        <w:t xml:space="preserve">२. उपरोक्त बमोजिम भएका छलफल र निर्णयहरू पश्चात अन्य विषय बाँकी नभएकोले आजको बैठक अध्यक्ष ज्यूको निर्णय बमोजिम यहि बिसर्जन गरिएको छ . </w:t>
+        <w:t xml:space="preserve">२. उपरोक्त बमोजिम भएका छलफल र निर्णयहरू पश्चात अन्य विषय बाँकी नभएकोले आजको बैठक अध्यक्ष ज्यूको निर्णय बमोजिम यही विसर्जन गरिएको छ । </w:t>
       </w:r>
     </w:p>
     <w:p>
@@ -720,7 +720,7 @@
           <w:sz w:val="36"/>
           <w:szCs w:val="36"/>
         </w:rPr>
-        <w:t xml:space="preserve">प्रा.लि दर्ता न {{registrationNumber}}</w:t>
+        <w:t xml:space="preserve">प्रा.लि. दर्ता नं. {{registrationNumber}}</w:t>
       </w:r>
     </w:p>
     <w:p>
@@ -809,7 +809,7 @@
           <w:sz w:val="30"/>
           <w:szCs w:val="32"/>
         </w:rPr>
-        <w:t xml:space="preserve">श्री </w:t>
+        <w:t xml:space="preserve"/>
       </w:r>
       <w:r>
         <w:rPr>
@@ -828,7 +828,7 @@
           <w:szCs w:val="32"/>
           <w:lang w:eastAsia="zh-HK"/>
         </w:rPr>
-        <w:t xml:space="preserve">को अध्यक्षतामा कम्पनीको वार्षिक साधारण सभा बसी निम्नानुसारको प्रस्ताव उपर छलफल गरि निम्नानुसारको निर्णय गरियो . </w:t>
+        <w:t xml:space="preserve">को अध्यक्षतामा कम्पनीको वार्षिक साधारण सभा बसी निम्नानुसारको प्रस्ताव उपर छलफल गरी निम्नानुसारको निर्णय गरियो । </w:t>
       </w:r>
     </w:p>
     <w:p>
@@ -1042,7 +1042,7 @@
           <w:szCs w:val="32"/>
           <w:lang w:eastAsia="zh-HK"/>
         </w:rPr>
-        <w:t xml:space="preserve">धानिकता माथि छलफछ गर्दा कम्पनी ऐन २०६३ र अन्य नियममा भएका व्यवस्था अनुसार नै साधारण सभा वोलाइएवाट र  </w:t>
+        <w:t xml:space="preserve">धानिकता माथि छलफल गर्दा कम्पनी ऐन २०६३ र अन्य नियममा भएका व्यवस्था अनुसार नै साधारण सभा बोलाइएबाट र  </w:t>
       </w:r>
       <w:r>
         <w:rPr>
@@ -1052,7 +1052,7 @@
           <w:lang w:eastAsia="zh-HK"/>
         </w:rPr>
         <w:lastRenderedPageBreak/>
-        <w:t xml:space="preserve">गणापुरक संख्या पनि भएवाट सभा संचालन गर्न वैधानिक हुने ठहर गरियो . </w:t>
+        <w:t xml:space="preserve">गणपूरक संख्या पनि भएबाट सभा सञ्चालन गर्न वैधानिक हुने ठहर गरियो । </w:t>
       </w:r>
     </w:p>
     <w:p>
@@ -1119,7 +1119,7 @@
           <w:szCs w:val="32"/>
           <w:lang w:eastAsia="zh-HK"/>
         </w:rPr>
-        <w:t>प्रस्ताव नं. १ः अध्यक्षज्यूको प्रतिवेदन सम्बन्धमा .</w:t>
+        <w:t>प्रस्ताव नं. १ ः अध्यक्षज्यूको प्रतिवेदन सम्बन्धमा ।</w:t>
       </w:r>
     </w:p>
     <w:p>
@@ -1144,7 +1144,7 @@
           <w:szCs w:val="32"/>
           <w:lang w:eastAsia="zh-HK"/>
         </w:rPr>
-        <w:t>प्रस्ताव नं. २ ः आर्थिक वर्ष {{fiscalYear}} को लेखा परीक्षक प्रतिवेदन अनुमोदन सम्बन्धमा.</w:t>
+        <w:t>प्रस्ताव नं. २ ः आर्थिक वर्ष {{fiscalYear}} को लेखापरीक्षण प्रतिवेदन अनुमोदन सम्बन्धमा ।</w:t>
       </w:r>
     </w:p>
     <w:p>
@@ -1168,7 +1168,7 @@
           <w:szCs w:val="32"/>
           <w:lang w:eastAsia="zh-HK"/>
         </w:rPr>
-        <w:t>प्रस्ताव नं. ३ ः आर्थिक वर्ष {{nextFiscalYear}} को लागि लेखापरीक्षक नियुक्ति सम्बन्धमा.</w:t>
+        <w:t>प्रस्ताव नं. ३ ः आर्थिक वर्ष {{nextFiscalYear}} को लागि लेखापरीक्षक नियुक्ति सम्बन्धमा ।</w:t>
       </w:r>
     </w:p>
     <w:p>
@@ -1192,7 +1192,7 @@
           <w:szCs w:val="32"/>
           <w:lang w:eastAsia="zh-HK"/>
         </w:rPr>
-        <w:t>प्रस्ताव नं. ४ ः विविध .</w:t>
+        <w:t>प्रस्ताव नं. ४ ः विविध ।</w:t>
       </w:r>
     </w:p>
     <w:p>
@@ -1240,7 +1240,7 @@
           <w:szCs w:val="32"/>
           <w:lang w:eastAsia="zh-HK"/>
         </w:rPr>
-        <w:t>निर्णय नं.१ः यस कम्पनीको गतवर्ष भएको वार्षिक साधारण सभा पश्चात हालसम्म कम्पनीको तर्फबाट भए गरिएका नियमित कार्यहरूको सम्बन्धमा संचालक समितिको तर्फबाट अध्यक्षज्यूले तयार गरी पेश गर्नु भएको कम्पनीको हालसम्मको प्रगति प्रतिवेदन उपर छलफल गरी सो प्रगति प्रतिवेदन यस सभाबाट सर्वसम्मतिले अनुमोदन गरिएको छ .</w:t>
+        <w:t>निर्णय नं. १ः यस कम्पनीको गतवर्ष भएको वार्षिक साधारण सभा पश्चात हालसम्म कम्पनीको तर्फबाट भए गरिएका नियमित कार्यहरूको सम्बन्धमा सञ्चालक समितिको तर्फबाट अध्यक्षज्यूले तयार गरी पेश गर्नु भएको कम्पनीको हालसम्मको प्रगति प्रतिवेदन उपर छलफल गरी सो प्रगति प्रतिवेदन यस सभाबाट सर्वसम्मतिले अनुमोदन गरिएको छ ।</w:t>
       </w:r>
     </w:p>
     <w:p>
@@ -1297,7 +1297,7 @@
           <w:szCs w:val="32"/>
           <w:lang w:eastAsia="zh-HK"/>
         </w:rPr>
-        <w:t>निर्णय नं. २ः प्रस्ताव नं. २ माथि छलफछ गर्दा आ. व. २{{fiscalYear}} को लेखापरीक्षण प्रतिवेदनले कम्पनीको वास्तविक आर्थिक अवस्थाको चित्रण गरेको हुदा उक्त प्रतिवेदनलाई अनुमोदन गर्ने निर्णय गरियो .</w:t>
+        <w:t>निर्णय नं. २ः प्रस्ताव नं. २ माथि छलफल गर्दा आ.व. {{fiscalYear}} को लेखापरीक्षण प्रतिवेदनले कम्पनीको वास्तविक आर्थिक अवस्थाको चित्रण गरेको हुँदा उक्त प्रतिवेदनलाई अनुमोदन गर्ने निर्णय गरियो ।</w:t>
       </w:r>
     </w:p>
     <w:p>
@@ -1337,16 +1337,16 @@
           <w:szCs w:val="32"/>
           <w:lang w:eastAsia="zh-HK"/>
         </w:rPr>
-        <w:t xml:space="preserve">निर्णय नं. ३ः प्रस्ताव नं. ३ माथि छलफछ गर्दा आ. व. २{{nextFiscalYear}} को लेखा परीक्षण गर्नको लागिलेखापरीक्षक </w:t>
-      </w:r>
-      <w:r>
-        <w:rPr>
-          <w:rFonts w:ascii="Mangal" w:hAnsi="Mangal"/>
-          <w:b/>
-          <w:sz w:val="32"/>
-          <w:szCs w:val="32"/>
-        </w:rPr>
-        <w:t>श्री {{auditorName}}लाई</w:t>
+        <w:t xml:space="preserve">निर्णय नं. ३ः प्रस्ताव नं. ३ माथि छलफल गर्दा आ.व. {{nextFiscalYear}} को लेखापरीक्षण गर्नको लागि लेखापरीक्षक </w:t>
+      </w:r>
+      <w:r>
+        <w:rPr>
+          <w:rFonts w:ascii="Mangal" w:hAnsi="Mangal"/>
+          <w:b/>
+          <w:sz w:val="32"/>
+          <w:szCs w:val="32"/>
+        </w:rPr>
+        <w:t>श्री {{auditorName}} लाई</w:t>
       </w:r>
       <w:r>
         <w:rPr>
@@ -1355,7 +1355,7 @@
           <w:szCs w:val="32"/>
           <w:lang w:eastAsia="zh-HK"/>
         </w:rPr>
-        <w:t xml:space="preserve"> नियुक्ति गर्ने निर्णय गरियो साथै निजको पारिश्रमिक रू {{auditFee}} तोक्ने भन्ने वारेमा पनि निर्णय गरियो .</w:t>
+        <w:t xml:space="preserve"> नियुक्ति गर्ने निर्णय गरियो साथै निजको पारिश्रमिक रू {{auditFee}} तोक्ने भन्ने बारेमा पनि निर्णय गरियो ।</w:t>
       </w:r>
     </w:p>
     <w:p>
@@ -1396,7 +1396,7 @@
           <w:szCs w:val="32"/>
           <w:lang w:eastAsia="zh-HK"/>
         </w:rPr>
-        <w:t>निर्णय नं. ४ ः प्रस्ताव नं. ४ माथि छलफल गर्दा अन्य छलफलको विषय नभएकोले आजको साधारण सभा विर्सजन गरियो .</w:t>
+        <w:t>निर्णय नं. ४ः प्रस्ताव नं. ४ माथि छलफल गर्दा अन्य छलफलको विषय नभएकोले आजको साधारण सभा विसर्जन गरियो ।</w:t>
       </w:r>
     </w:p>
     <w:p>
@@ -1539,7 +1539,7 @@
           <w:szCs w:val="32"/>
           <w:lang w:eastAsia="zh-HK"/>
         </w:rPr>
-        <w:t>कम्पनीऐन २०६३ को दफा ५१ कावमोजिम पेश गरेको प्रतिवेदन</w:t>
+        <w:t>कम्पनी ऐन २०६३ को दफा ५१ को बमोजिम पेश गरेको प्रतिवेदन</w:t>
       </w:r>
     </w:p>
     <w:p>
@@ -1598,7 +1598,7 @@
                 <w:szCs w:val="32"/>
                 <w:lang w:eastAsia="zh-HK"/>
               </w:rPr>
-              <w:t>-क_</w:t>
+              <w:t>-क)</w:t>
             </w:r>
           </w:p>
         </w:tc>
@@ -1656,7 +1656,7 @@
                 <w:szCs w:val="32"/>
                 <w:lang w:eastAsia="zh-HK"/>
               </w:rPr>
-              <w:t>-क_</w:t>
+              <w:t>-क)</w:t>
             </w:r>
           </w:p>
         </w:tc>
@@ -1680,7 +1680,7 @@
                 <w:szCs w:val="32"/>
                 <w:lang w:eastAsia="zh-HK"/>
               </w:rPr>
-              <w:t>अधिकृत पुँजी रू{{authorizedCapital}}र शेयर संख्या२,००,०००थान</w:t>
+              <w:t>अधिकृत पुँजी रू {{authorizedCapital}} र शेयर संख्या २,००,००० थान</w:t>
             </w:r>
           </w:p>
         </w:tc>
@@ -1709,7 +1709,7 @@
                 <w:szCs w:val="32"/>
                 <w:lang w:eastAsia="zh-HK"/>
               </w:rPr>
-              <w:t>-ख_</w:t>
+              <w:t>-ख)</w:t>
             </w:r>
           </w:p>
         </w:tc>
@@ -1767,7 +1767,7 @@
                 <w:szCs w:val="32"/>
                 <w:lang w:eastAsia="zh-HK"/>
               </w:rPr>
-              <w:t>-ख_</w:t>
+              <w:t>-ख)</w:t>
             </w:r>
           </w:p>
         </w:tc>
@@ -1820,7 +1820,7 @@
                 <w:szCs w:val="32"/>
                 <w:lang w:eastAsia="zh-HK"/>
               </w:rPr>
-              <w:t xml:space="preserve">-ग_ </w:t>
+              <w:t xml:space="preserve">-ग) </w:t>
             </w:r>
           </w:p>
         </w:tc>
@@ -1878,7 +1878,7 @@
                 <w:szCs w:val="32"/>
                 <w:lang w:eastAsia="zh-HK"/>
               </w:rPr>
-              <w:t>-ग_</w:t>
+              <w:t>-ग)</w:t>
             </w:r>
           </w:p>
         </w:tc>
@@ -1931,7 +1931,7 @@
                 <w:szCs w:val="32"/>
                 <w:lang w:eastAsia="zh-HK"/>
               </w:rPr>
-              <w:t>-घ_</w:t>
+              <w:t>-घ)</w:t>
             </w:r>
           </w:p>
         </w:tc>
@@ -1955,7 +1955,7 @@
                 <w:szCs w:val="32"/>
                 <w:lang w:eastAsia="zh-HK"/>
               </w:rPr>
-              <w:t>शेयर पिच्छे मागभएको रकम</w:t>
+              <w:t>शेयर पिच्छे माग भएको रकम</w:t>
             </w:r>
           </w:p>
           <w:p>
@@ -1989,7 +1989,7 @@
                 <w:szCs w:val="32"/>
                 <w:lang w:eastAsia="zh-HK"/>
               </w:rPr>
-              <w:t>-घ_</w:t>
+              <w:t>-घ)</w:t>
             </w:r>
           </w:p>
         </w:tc>
@@ -2042,7 +2042,7 @@
                 <w:szCs w:val="32"/>
                 <w:lang w:eastAsia="zh-HK"/>
               </w:rPr>
-              <w:t>-ङ_</w:t>
+              <w:t>-ङ)</w:t>
             </w:r>
           </w:p>
         </w:tc>
@@ -2066,7 +2066,7 @@
                 <w:szCs w:val="32"/>
                 <w:lang w:eastAsia="zh-HK"/>
               </w:rPr>
-              <w:t>किस्ताअसुलभएको जम्मा रकम</w:t>
+              <w:t>किस्ता असुल भएको जम्मा रकम</w:t>
             </w:r>
           </w:p>
           <w:p>
@@ -2100,7 +2100,7 @@
                 <w:szCs w:val="32"/>
                 <w:lang w:eastAsia="zh-HK"/>
               </w:rPr>
-              <w:t>-ङ_</w:t>
+              <w:t>-ङ)</w:t>
             </w:r>
           </w:p>
         </w:tc>
@@ -2153,7 +2153,7 @@
                 <w:szCs w:val="32"/>
                 <w:lang w:eastAsia="zh-HK"/>
               </w:rPr>
-              <w:t>-च_</w:t>
+              <w:t>-च)</w:t>
             </w:r>
           </w:p>
         </w:tc>
@@ -2211,7 +2211,7 @@
                 <w:szCs w:val="32"/>
                 <w:lang w:eastAsia="zh-HK"/>
               </w:rPr>
-              <w:t>-च_</w:t>
+              <w:t>-च)</w:t>
             </w:r>
           </w:p>
         </w:tc>
@@ -2235,7 +2235,7 @@
                 <w:szCs w:val="32"/>
                 <w:lang w:eastAsia="zh-HK"/>
               </w:rPr>
-              <w:t>छैन .</w:t>
+              <w:t>छैन ।</w:t>
             </w:r>
           </w:p>
         </w:tc>
@@ -2264,7 +2264,7 @@
                 <w:szCs w:val="32"/>
                 <w:lang w:eastAsia="zh-HK"/>
               </w:rPr>
-              <w:t>-छ_</w:t>
+              <w:t>-छ)</w:t>
             </w:r>
           </w:p>
         </w:tc>
@@ -2341,7 +2341,7 @@
                 <w:szCs w:val="32"/>
                 <w:lang w:eastAsia="zh-HK"/>
               </w:rPr>
-              <w:t>-छ_</w:t>
+              <w:t>-छ)</w:t>
             </w:r>
           </w:p>
         </w:tc>
@@ -2365,7 +2365,7 @@
                 <w:szCs w:val="32"/>
                 <w:lang w:eastAsia="zh-HK"/>
               </w:rPr>
-              <w:t>छैन .</w:t>
+              <w:t>छैन ।</w:t>
             </w:r>
           </w:p>
         </w:tc>
@@ -2395,7 +2395,7 @@
                 <w:lang w:eastAsia="zh-HK"/>
               </w:rPr>
               <w:lastRenderedPageBreak/>
-              <w:t>-ज_</w:t>
+              <w:t>-ज)</w:t>
             </w:r>
           </w:p>
         </w:tc>
@@ -2453,7 +2453,7 @@
                 <w:szCs w:val="32"/>
                 <w:lang w:eastAsia="zh-HK"/>
               </w:rPr>
-              <w:t>-ज_</w:t>
+              <w:t>-ज)</w:t>
             </w:r>
           </w:p>
         </w:tc>
@@ -2477,7 +2477,7 @@
                 <w:szCs w:val="32"/>
                 <w:lang w:eastAsia="zh-HK"/>
               </w:rPr>
-              <w:t>छैन .</w:t>
+              <w:t>छैन ।</w:t>
             </w:r>
           </w:p>
         </w:tc>
@@ -2506,7 +2506,7 @@
                 <w:szCs w:val="32"/>
                 <w:lang w:eastAsia="zh-HK"/>
               </w:rPr>
-              <w:t>-झ_</w:t>
+              <w:t>-झ)</w:t>
             </w:r>
           </w:p>
         </w:tc>
@@ -2530,7 +2530,7 @@
                 <w:szCs w:val="32"/>
                 <w:lang w:eastAsia="zh-HK"/>
               </w:rPr>
-              <w:t>बैक,वित्तिय संस्था वा अन्य कुनै व्यक्तिबाट लिएको ऋणा वा कम्पनीले दिएको जमानत</w:t>
+              <w:t>बैंक, वित्तीय संस्था वा अन्य कुनै व्यक्तिबाट लिएको ऋण वा कम्पनीले दिएको जमानत</w:t>
             </w:r>
           </w:p>
         </w:tc>
@@ -2554,7 +2554,7 @@
                 <w:szCs w:val="32"/>
                 <w:lang w:eastAsia="zh-HK"/>
               </w:rPr>
-              <w:t>-झ_</w:t>
+              <w:t>-झ)</w:t>
             </w:r>
           </w:p>
         </w:tc>
@@ -2606,7 +2606,7 @@
                 <w:szCs w:val="32"/>
                 <w:lang w:eastAsia="zh-HK"/>
               </w:rPr>
-              <w:t>-झ_१</w:t>
+              <w:t>-झ)१</w:t>
             </w:r>
           </w:p>
         </w:tc>
@@ -2629,7 +2629,7 @@
                 <w:sz w:val="34"/>
                 <w:szCs w:val="40"/>
               </w:rPr>
-              <w:t>अन्य कम्पनीको शेयर वा डिवेञ्चरमा लगानी गरेको भए त्यस्तो कम्पनीको नाम र दर्ता नं. तथा शेयर वा डिवेञ्चरमा गरेको लगानी रकम</w:t>
+              <w:t>अन्य कम्पनीको शेयर वा डिबेञ्चरमा लगानी गरेको भए त्यस्तो कम्पनीको नाम र दर्ता नं. तथा शेयर वा डिबेञ्चरमा गरेको लगानी रकम</w:t>
             </w:r>
           </w:p>
         </w:tc>
@@ -2653,7 +2653,7 @@
                 <w:szCs w:val="32"/>
                 <w:lang w:eastAsia="zh-HK"/>
               </w:rPr>
-              <w:t>-झ_१</w:t>
+              <w:t>-झ)१</w:t>
             </w:r>
           </w:p>
         </w:tc>
@@ -2677,7 +2677,7 @@
                 <w:szCs w:val="32"/>
                 <w:lang w:eastAsia="zh-HK"/>
               </w:rPr>
-              <w:t>छैन .</w:t>
+              <w:t>छैन ।</w:t>
             </w:r>
           </w:p>
         </w:tc>
@@ -2706,7 +2706,7 @@
                 <w:szCs w:val="32"/>
                 <w:lang w:eastAsia="zh-HK"/>
               </w:rPr>
-              <w:t>-ञ_</w:t>
+              <w:t>-ञ)</w:t>
             </w:r>
           </w:p>
         </w:tc>
@@ -2754,7 +2754,7 @@
                 <w:szCs w:val="32"/>
                 <w:lang w:eastAsia="zh-HK"/>
               </w:rPr>
-              <w:t xml:space="preserve">-ञ_ </w:t>
+              <w:t xml:space="preserve">-ञ) </w:t>
             </w:r>
           </w:p>
         </w:tc>
@@ -3049,7 +3049,7 @@
           <w:sz w:val="36"/>
           <w:szCs w:val="36"/>
         </w:rPr>
-        <w:t>प्रा.लि</w:t>
+        <w:t>प्रा.लि.</w:t>
       </w:r>
       <w:proofErr w:type="spellEnd"/>
       <w:proofErr w:type="gramEnd"/>
@@ -3077,7 +3077,7 @@
           <w:sz w:val="36"/>
           <w:szCs w:val="36"/>
         </w:rPr>
-        <w:t xml:space="preserve"> न</w:t>
+        <w:t xml:space="preserve"> नं.</w:t>
       </w:r>
       <w:r>
         <w:rPr>
@@ -3158,7 +3158,7 @@
           <w:sz w:val="32"/>
           <w:szCs w:val="32"/>
         </w:rPr>
-        <w:t xml:space="preserve"> ः{{</w:t>
+        <w:t xml:space="preserve"> ः {{</w:t>
       </w:r>
       <w:proofErr w:type="spellStart"/>
       <w:r>
@@ -3202,7 +3202,7 @@
           <w:sz w:val="32"/>
           <w:szCs w:val="32"/>
         </w:rPr>
-        <w:t>श्रीमानकम्पनी रजिष्ट्रारज्यू,</w:t>
+        <w:t>श्रीमान् कम्पनी रजिष्ट्रार ज्यू,</w:t>
       </w:r>
     </w:p>
     <w:p>
@@ -3236,7 +3236,7 @@
           <w:sz w:val="32"/>
           <w:szCs w:val="32"/>
         </w:rPr>
-        <w:t>त्रिपुरेश्वर, काठमाणडौ .</w:t>
+        <w:t>त्रिपुरेश्वर, काठमाडौं ।</w:t>
       </w:r>
     </w:p>
     <w:p>
@@ -3263,7 +3263,7 @@
           <w:sz w:val="32"/>
           <w:szCs w:val="32"/>
         </w:rPr>
-        <w:t>विषयःकम्पनीको</w:t>
+        <w:t>विषयः कम्पनीको</w:t>
       </w:r>
       <w:proofErr w:type="spellEnd"/>
       <w:r>
@@ -3281,7 +3281,7 @@
           <w:sz w:val="32"/>
           <w:szCs w:val="32"/>
         </w:rPr>
-        <w:t>साधरणा</w:t>
+        <w:t>साधारण</w:t>
       </w:r>
       <w:proofErr w:type="spellEnd"/>
       <w:r>
@@ -3335,7 +3335,7 @@
           <w:sz w:val="32"/>
           <w:szCs w:val="32"/>
         </w:rPr>
-        <w:t>बारे .</w:t>
+        <w:t>बारे ।</w:t>
       </w:r>
       <w:proofErr w:type="gramEnd"/>
     </w:p>
@@ -3420,7 +3420,7 @@
           <w:szCs w:val="32"/>
           <w:lang w:eastAsia="zh-HK"/>
         </w:rPr>
-        <w:t>सम्वन्धमायस</w:t>
+        <w:t>सम्बन्धमा यस</w:t>
       </w:r>
       <w:proofErr w:type="spellEnd"/>
       <w:r>
@@ -3506,7 +3506,7 @@
           <w:sz w:val="32"/>
           <w:szCs w:val="32"/>
         </w:rPr>
-        <w:t>आ.व</w:t>
+        <w:t>आ.व.</w:t>
       </w:r>
       <w:proofErr w:type="spellEnd"/>
       <w:r>
@@ -3551,7 +3551,7 @@
           <w:sz w:val="32"/>
           <w:szCs w:val="32"/>
         </w:rPr>
-        <w:t xml:space="preserve"> साधारण सभा र लेखापरीक्षण प्रतिबेदन सहितदफा ५१ सहितयोनिवेदन पेश गरेको </w:t>
+        <w:t xml:space="preserve"> साधारण सभा र लेखापरीक्षण प्रतिवेदन सहित दफा ५१ सहित यो निवेदन पेश गरेको </w:t>
       </w:r>
       <w:proofErr w:type="gramStart"/>
       <w:r>
@@ -3560,7 +3560,7 @@
           <w:sz w:val="32"/>
           <w:szCs w:val="32"/>
         </w:rPr>
-        <w:t>छु .</w:t>
+        <w:t>छु ।</w:t>
       </w:r>
       <w:proofErr w:type="gramEnd"/>
     </w:p>
@@ -3608,7 +3608,7 @@
           <w:szCs w:val="36"/>
           <w:lang w:val="sv-SE"/>
         </w:rPr>
-        <w:t xml:space="preserve">१.कम्पनीको लेखा परीक्षणा प्रतिवेदन </w:t>
+        <w:t xml:space="preserve">१. कम्पनीको लेखापरीक्षण प्रतिवेदन </w:t>
       </w:r>
     </w:p>
     <w:p>
@@ -3633,7 +3633,7 @@
           <w:lang w:val="sv-SE"/>
         </w:rPr>
         <w:lastRenderedPageBreak/>
-        <w:t>२.कम्पनीको संचालक समितिको निर्णय</w:t>
+        <w:t>२. कम्पनीको सञ्चालक समितिको निर्णय</w:t>
       </w:r>
     </w:p>
     <w:p>
@@ -3657,7 +3657,7 @@
           <w:szCs w:val="36"/>
           <w:lang w:val="sv-SE"/>
         </w:rPr>
-        <w:t>३.कम्पनीको वार्षिक साधारण सभाको निर्णय</w:t>
+        <w:t>३. कम्पनीको वार्षिक साधारण सभाको निर्णय</w:t>
       </w:r>
     </w:p>
     <w:p>
@@ -3681,7 +3681,7 @@
           <w:szCs w:val="36"/>
           <w:lang w:val="sv-SE"/>
         </w:rPr>
-        <w:t xml:space="preserve">४.कम्पनी ऐनको दफा ५१ नं. बमोजिमको विवरणा </w:t>
+        <w:t xml:space="preserve">४. कम्पनी ऐनको दफा ५१ नं. बमोजिमको विवरण </w:t>
       </w:r>
     </w:p>
     <w:p>
@@ -3919,7 +3919,7 @@
           <w:sz w:val="36"/>
           <w:szCs w:val="36"/>
         </w:rPr>
-        <w:t xml:space="preserve">प्रा.लि दर्ता न {{registrationNumber}}</w:t>
+        <w:t xml:space="preserve">प्रा.लि. दर्ता नं. {{registrationNumber}}</w:t>
       </w:r>
     </w:p>
     <w:p>
@@ -3951,58 +3951,58 @@
           <w:sz w:val="32"/>
           <w:szCs w:val="32"/>
         </w:rPr>
-        <w:t>मितिः– {{letterDate}}</w:t>
-      </w:r>
-    </w:p>
-    <w:p>
-      <w:pPr>
-        <w:rPr>
-          <w:rFonts w:ascii="Mangal" w:hAnsi="Mangal"/>
-          <w:sz w:val="32"/>
-          <w:szCs w:val="32"/>
-        </w:rPr>
-      </w:pPr>
-      <w:r>
-        <w:rPr>
-          <w:rFonts w:ascii="Mangal" w:hAnsi="Mangal"/>
-          <w:sz w:val="32"/>
-          <w:szCs w:val="32"/>
-        </w:rPr>
-        <w:t>श्रीमान् रजिष्ट्ार ज्यू,</w:t>
-      </w:r>
-    </w:p>
-    <w:p>
-      <w:pPr>
-        <w:rPr>
-          <w:rFonts w:ascii="Mangal" w:hAnsi="Mangal"/>
-          <w:sz w:val="32"/>
-          <w:szCs w:val="32"/>
-        </w:rPr>
-      </w:pPr>
-      <w:r>
-        <w:rPr>
-          <w:rFonts w:ascii="Mangal" w:hAnsi="Mangal"/>
-          <w:sz w:val="32"/>
-          <w:szCs w:val="32"/>
-        </w:rPr>
-        <w:t>कम्पनी रजिष्ट्ार कार्यालय</w:t>
-      </w:r>
-    </w:p>
-    <w:p>
-      <w:pPr>
-        <w:rPr>
-          <w:rFonts w:ascii="Mangal" w:hAnsi="Mangal"/>
-          <w:sz w:val="32"/>
-          <w:szCs w:val="32"/>
-        </w:rPr>
-      </w:pPr>
-      <w:r>
-        <w:rPr>
-          <w:rFonts w:ascii="Mangal" w:hAnsi="Mangal"/>
-          <w:sz w:val="32"/>
-          <w:szCs w:val="32"/>
-        </w:rPr>
-        <w:t xml:space="preserve">त्रिपुरेश्वर , काठमाडौं . </w:t>
+        <w:t>मिति ः {{letterDate}}</w:t>
+      </w:r>
+    </w:p>
+    <w:p>
+      <w:pPr>
+        <w:rPr>
+          <w:rFonts w:ascii="Mangal" w:hAnsi="Mangal"/>
+          <w:sz w:val="32"/>
+          <w:szCs w:val="32"/>
+        </w:rPr>
+      </w:pPr>
+      <w:r>
+        <w:rPr>
+          <w:rFonts w:ascii="Mangal" w:hAnsi="Mangal"/>
+          <w:sz w:val="32"/>
+          <w:szCs w:val="32"/>
+        </w:rPr>
+        <w:t>श्रीमान् रजिष्ट्रार ज्यू,</w:t>
+      </w:r>
+    </w:p>
+    <w:p>
+      <w:pPr>
+        <w:rPr>
+          <w:rFonts w:ascii="Mangal" w:hAnsi="Mangal"/>
+          <w:sz w:val="32"/>
+          <w:szCs w:val="32"/>
+        </w:rPr>
+      </w:pPr>
+      <w:r>
+        <w:rPr>
+          <w:rFonts w:ascii="Mangal" w:hAnsi="Mangal"/>
+          <w:sz w:val="32"/>
+          <w:szCs w:val="32"/>
+        </w:rPr>
+        <w:t>कम्पनी रजिष्ट्रारको कार्यालय</w:t>
+      </w:r>
+    </w:p>
+    <w:p>
+      <w:pPr>
+        <w:rPr>
+          <w:rFonts w:ascii="Mangal" w:hAnsi="Mangal"/>
+          <w:sz w:val="32"/>
+          <w:szCs w:val="32"/>
+        </w:rPr>
+      </w:pPr>
+      <w:r>
+        <w:rPr>
+          <w:rFonts w:ascii="Mangal" w:hAnsi="Mangal"/>
+          <w:sz w:val="32"/>
+          <w:szCs w:val="32"/>
+        </w:rPr>
+        <w:t xml:space="preserve">त्रिपुरेश्वर, काठमाडौं । </w:t>
       </w:r>
     </w:p>
     <w:p>
@@ -4020,7 +4020,7 @@
           <w:sz w:val="32"/>
           <w:szCs w:val="32"/>
         </w:rPr>
-        <w:t xml:space="preserve">                विषयः– लेखापरीक्षकको नियुक्तीको जानकारी पेश गरेको वारे .</w:t>
+        <w:t xml:space="preserve">                विषयः लेखापरीक्षकको नियुक्तिको जानकारी पेश गरेको बारे ।</w:t>
       </w:r>
     </w:p>
     <w:p>
@@ -4038,7 +4038,7 @@
           <w:sz w:val="32"/>
           <w:szCs w:val="32"/>
         </w:rPr>
-        <w:t>महोदय ,</w:t>
+        <w:t>महोदय,</w:t>
       </w:r>
     </w:p>
     <w:p>
@@ -4056,7 +4056,7 @@
           <w:sz w:val="32"/>
           <w:szCs w:val="32"/>
         </w:rPr>
-        <w:t xml:space="preserve">उपरोक्त सम्बन्धमा यस प्रा. लि को आ. ब. {{fiscalYear}} को लेखापरीक्षण कार्यका निमित्त {{auditFirmName}} का {{auditorTitle}} {{auditorName}} लाई  नियुक्त गरीएको र पारीश्रमीक रू {{auditFee}} कायम हुने गरी पारीश्रमीक निर्धारणा गरीएको यस पत्रका साथ निबेदन गर्न चाहान्छु . </w:t>
+        <w:t xml:space="preserve">उपरोक्त सम्बन्धमा यस प्रा.लि. को आ.व. {{fiscalYear}} को लेखापरीक्षण कार्यका निमित्त {{auditFirmName}} का {{auditorTitle}} {{auditorName}} लाई नियुक्त गरिएको र पारिश्रमिक रू {{auditFee}} कायम हुने गरी पारिश्रमिक निर्धारण गरिएको यस पत्रका साथ निवेदन गर्न चाहन्छु । </w:t>
       </w:r>
     </w:p>
     <w:p>

</xml_diff>

<commit_message>
fix(bmAgmMinutes): stop dotted-circle glyph from rendering in "वैधानिकता"
The vowel sign ऐ (matra) sat in its own run with bold applied while the
surrounding letters were normal weight — a leftover split from the
template's Preeti-to-Unicode conversion. Bold forces a different font
resource for shaping, which breaks Devanagari mark attachment and renders
as a dotted-circle placeholder (◌) in both the browser preview and Word.
Merged the three-way split ("सभाको व" + bold "ै" + "धानिकता...") into one
run per occurrence (appears twice) with uniform formatting. Verified no
other runs anywhere in the document consist of an isolated combining mark,
and confirmed via the app's live docx-preview that both occurrences now
render as a single, uniformly-styled text node.
</commit_message>
<xml_diff>
--- a/assets/templates/bm-agm-minutes.docx
+++ b/assets/templates/bm-agm-minutes.docx
@@ -980,27 +980,7 @@
           <w:szCs w:val="32"/>
           <w:lang w:eastAsia="zh-HK"/>
         </w:rPr>
-        <w:t>सभाको व</w:t>
-      </w:r>
-      <w:r>
-        <w:rPr>
-          <w:rFonts w:ascii="Mangal" w:eastAsia="PMingLiU" w:hAnsi="Mangal"/>
-          <w:b/>
-          <w:bCs/>
-          <w:sz w:val="32"/>
-          <w:szCs w:val="32"/>
-          <w:lang w:eastAsia="zh-HK"/>
-        </w:rPr>
-        <w:t>ै</w:t>
-      </w:r>
-      <w:r>
-        <w:rPr>
-          <w:rFonts w:ascii="Mangal" w:eastAsia="PMingLiU" w:hAnsi="Mangal"/>
-          <w:sz w:val="32"/>
-          <w:szCs w:val="32"/>
-          <w:lang w:eastAsia="zh-HK"/>
-        </w:rPr>
-        <w:t>धानिकता</w:t>
+        <w:t>सभाको वैधानिकता</w:t>
       </w:r>
     </w:p>
     <w:p>
@@ -1022,27 +1002,7 @@
           <w:szCs w:val="32"/>
           <w:lang w:eastAsia="zh-HK"/>
         </w:rPr>
-        <w:t>सभाको व</w:t>
-      </w:r>
-      <w:r>
-        <w:rPr>
-          <w:rFonts w:ascii="Mangal" w:eastAsia="PMingLiU" w:hAnsi="Mangal"/>
-          <w:b/>
-          <w:bCs/>
-          <w:sz w:val="32"/>
-          <w:szCs w:val="32"/>
-          <w:lang w:eastAsia="zh-HK"/>
-        </w:rPr>
-        <w:t>ै</w:t>
-      </w:r>
-      <w:r>
-        <w:rPr>
-          <w:rFonts w:ascii="Mangal" w:eastAsia="PMingLiU" w:hAnsi="Mangal"/>
-          <w:sz w:val="32"/>
-          <w:szCs w:val="32"/>
-          <w:lang w:eastAsia="zh-HK"/>
-        </w:rPr>
-        <w:t xml:space="preserve">धानिकता माथि छलफल गर्दा कम्पनी ऐन २०६३ र अन्य नियममा भएका व्यवस्था अनुसार नै साधारण सभा बोलाइएबाट र  </w:t>
+        <w:t xml:space="preserve">सभाको वैधानिकता माथि छलफल गर्दा कम्पनी ऐन २०६३ र अन्य नियममा भएका व्यवस्था अनुसार नै साधारण सभा बोलाइएबाट र  </w:t>
       </w:r>
       <w:r>
         <w:rPr>

</xml_diff>

<commit_message>
fix(registrar): gate AGM director-reappointment item on board-change, renumber around it
The AGM's own agenda item/decision 4 ("संचालकहरुको पुनर्नियुक्ति") restates
exactly what the separate "Change of Board of Director" set formalises,
so it now only prints the year that set is generated — gated on the same
boardChanged flag as the standalone block, via two more independent
{{#boardChanged}} wraps (paragraphs 49 and 63-64).

With items/decisions 4 (reappointment) and 5 (extra proposal) both
independently conditional ahead of 6 (विविध), their own displayed numbers
became tokens too — agmExtraItemNum/agmExtraDecisionNum read 4 or 5
depending on whether item 4 printed, and विविध's renumbering formula now
accounts for both flags instead of just the extra proposal's. Verified
live for all four (boardChanged, agmHasExtra) combinations.

Co-Authored-By: Claude Sonnet 5 <noreply@anthropic.com>
</commit_message>
<xml_diff>
--- a/assets/templates/bm-agm-minutes.docx
+++ b/assets/templates/bm-agm-minutes.docx
@@ -850,6 +850,11 @@
       </w:r>
     </w:p>
     <w:p>
+      <w:r>
+        <w:t>{{#boardChanged}}</w:t>
+      </w:r>
+    </w:p>
+    <w:p>
       <w:pPr>
         <w:tabs>
           <w:tab w:val="left" w:pos="8505"/>
@@ -873,6 +878,11 @@
     </w:p>
     <w:p>
       <w:r>
+        <w:t>{{/boardChanged}}</w:t>
+      </w:r>
+    </w:p>
+    <w:p>
+      <w:r>
         <w:t>{{#agmHasExtra}}</w:t>
       </w:r>
     </w:p>
@@ -895,7 +905,7 @@
           <w:sz w:val="32"/>
           <w:szCs w:val="32"/>
         </w:rPr>
-        <w:t xml:space="preserve">५) {{agmExtraProposalTitle}}</w:t>
+        <w:t xml:space="preserve">{{agmExtraItemNum}}) {{agmExtraProposalTitle}}</w:t>
       </w:r>
     </w:p>
     <w:p>
@@ -1141,6 +1151,11 @@
       </w:pPr>
     </w:p>
     <w:p>
+      <w:r>
+        <w:t>{{#boardChanged}}</w:t>
+      </w:r>
+    </w:p>
+    <w:p>
       <w:pPr>
         <w:spacing w:after="0"/>
         <w:ind w:left="360" w:hanging="360"/>
@@ -1194,6 +1209,11 @@
       </w:r>
     </w:p>
     <w:p>
+      <w:r>
+        <w:t>{{/boardChanged}}</w:t>
+      </w:r>
+    </w:p>
+    <w:p>
       <w:pPr>
         <w:spacing w:after="0"/>
         <w:rPr>
@@ -1236,7 +1256,7 @@
           <w:sz w:val="30"/>
           <w:szCs w:val="30"/>
         </w:rPr>
-        <w:t xml:space="preserve">निर्णय नं. ५ :</w:t>
+        <w:t xml:space="preserve">निर्णय नं. {{agmExtraDecisionNum}} :</w:t>
       </w:r>
       <w:r>
         <w:rPr>

</xml_diff>

<commit_message>
fix(registrar): gate registrar-letter tapsil item 6 on board-change too
Item 5 ("संचालकको पुननियुक्ति सम्बन्धमा") was already conditional on
boardChanged; item 6 ("दफा ९२, को विवरण") was not, even though the §92
declaration it announces is itself only generated inside the
boardChanged-gated section further down the document — so the letter
used to promise an attachment that was never produced when the box was
unchecked. Both items are adjacent with nothing between them, so they're
now one combined {{#boardChanged}} block instead of item 5's standalone
one. Verified live: unchecked hides both lines entirely, checked shows
both as before.

Co-Authored-By: Claude Sonnet 5 <noreply@anthropic.com>
</commit_message>
<xml_diff>
--- a/assets/templates/bm-agm-minutes.docx
+++ b/assets/templates/bm-agm-minutes.docx
@@ -3490,26 +3490,26 @@
       </w:r>
     </w:p>
     <w:p>
+      <w:pPr>
+        <w:ind w:firstLine="720"/>
+        <w:rPr>
+          <w:rFonts w:ascii="Mangal" w:hAnsi="Mangal"/>
+          <w:sz w:val="32"/>
+          <w:szCs w:val="32"/>
+        </w:rPr>
+      </w:pPr>
+      <w:r>
+        <w:rPr>
+          <w:rFonts w:ascii="Mangal" w:hAnsi="Mangal"/>
+          <w:sz w:val="32"/>
+          <w:szCs w:val="32"/>
+        </w:rPr>
+        <w:t xml:space="preserve">६. दफा ९२, को विवरण ।</w:t>
+      </w:r>
+    </w:p>
+    <w:p>
       <w:r>
         <w:t>{{/boardChanged}}</w:t>
-      </w:r>
-    </w:p>
-    <w:p>
-      <w:pPr>
-        <w:ind w:firstLine="720"/>
-        <w:rPr>
-          <w:rFonts w:ascii="Mangal" w:hAnsi="Mangal"/>
-          <w:sz w:val="32"/>
-          <w:szCs w:val="32"/>
-        </w:rPr>
-      </w:pPr>
-      <w:r>
-        <w:rPr>
-          <w:rFonts w:ascii="Mangal" w:hAnsi="Mangal"/>
-          <w:sz w:val="32"/>
-          <w:szCs w:val="32"/>
-        </w:rPr>
-        <w:t xml:space="preserve">६. दफा ९२, को विवरण ।</w:t>
       </w:r>
     </w:p>
     <w:p>

</xml_diff>